<commit_message>
chore: remove unused configuration file
</commit_message>
<xml_diff>
--- a/중학교~고등학교 과정/꽃을 비교해보자/중학교_과학수행평가_붓꽃_탐구보고서.docx
+++ b/중학교~고등학교 과정/꽃을 비교해보자/중학교_과학수행평가_붓꽃_탐구보고서.docx
@@ -1,40 +1,60 @@
 
 <file path=word/document.xml><?xml version="1.0" encoding="utf-8"?>
-<w:document xmlns:o="urn:schemas-microsoft-com:office:office" xmlns:r="http://schemas.openxmlformats.org/officeDocument/2006/relationships" xmlns:v="urn:schemas-microsoft-com:vml" xmlns:w="http://schemas.openxmlformats.org/wordprocessingml/2006/main" xmlns:w10="urn:schemas-microsoft-com:office:word" xmlns:wp="http://schemas.openxmlformats.org/drawingml/2006/wordprocessingDrawing" xmlns:pic="http://schemas.openxmlformats.org/drawingml/2006/picture" xmlns:wps="http://schemas.microsoft.com/office/word/2010/wordprocessingShape" xmlns:wpg="http://schemas.microsoft.com/office/word/2010/wordprocessingGroup" xmlns:mc="http://schemas.openxmlformats.org/markup-compatibility/2006" xmlns:wp14="http://schemas.microsoft.com/office/word/2010/wordprocessingDrawing" xmlns:w14="http://schemas.microsoft.com/office/word/2010/wordml" xmlns:w15="http://schemas.microsoft.com/office/word/2012/wordml" mc:Ignorable="w14 wp14 w15">
+<w:document xmlns:wpc="http://schemas.microsoft.com/office/word/2010/wordprocessingCanvas" xmlns:mc="http://schemas.openxmlformats.org/markup-compatibility/2006" xmlns:o="urn:schemas-microsoft-com:office:office" xmlns:r="http://schemas.openxmlformats.org/officeDocument/2006/relationships" xmlns:m="http://schemas.openxmlformats.org/officeDocument/2006/math" xmlns:v="urn:schemas-microsoft-com:vml" xmlns:wp14="http://schemas.microsoft.com/office/word/2010/wordprocessingDrawing" xmlns:wp="http://schemas.openxmlformats.org/drawingml/2006/wordprocessingDrawing" xmlns:w10="urn:schemas-microsoft-com:office:word" xmlns:w="http://schemas.openxmlformats.org/wordprocessingml/2006/main" xmlns:w14="http://schemas.microsoft.com/office/word/2010/wordml" xmlns:w15="http://schemas.microsoft.com/office/word/2012/wordml" xmlns:w16se="http://schemas.microsoft.com/office/word/2015/wordml/symex" xmlns:w16cid="http://schemas.microsoft.com/office/word/2016/wordml/cid" xmlns:w16="http://schemas.microsoft.com/office/word/2018/wordml" xmlns:w16cex="http://schemas.microsoft.com/office/word/2018/wordml/cex" xmlns:w16sdtdh="http://schemas.microsoft.com/office/word/2020/wordml/sdtdatahash" xmlns:wne="http://schemas.microsoft.com/office/word/2006/wordml" xmlns:wpg="http://schemas.microsoft.com/office/word/2010/wordprocessingGroup" xmlns:wps="http://schemas.microsoft.com/office/word/2010/wordprocessingShape" mc:Ignorable="w14 w15 w16se w16cid w16 w16cex w16sdtdh wp14">
   <w:body>
     <w:p>
       <w:pPr>
         <w:pStyle w:val="Heading1"/>
-        <w:keepNext w:val="true"/>
+        <w:keepNext/>
         <w:keepLines/>
         <w:spacing w:before="480" w:after="0"/>
-        <w:rPr/>
+        <w:jc w:val="left"/>
       </w:pPr>
       <w:r>
         <w:rPr>
+          <w:rFonts w:ascii="Calibri" w:hAnsi="Calibri" w:eastAsia="ＭＳ ゴシック" w:cs="Calibri" w:asciiTheme="majorHAnsi" w:hAnsiTheme="majorHAnsi" w:eastAsiaTheme="majorEastAsia" w:csTheme="majorBidi"/>
           <w:b/>
+          <w:bCs/>
+          <w:color w:val="365F91" w:themeColor="accent1" w:themeShade="bf"/>
+          <w:kern w:val="0"/>
           <w:sz w:val="36"/>
+          <w:szCs w:val="28"/>
         </w:rPr>
         <w:t>[</w:t>
       </w:r>
       <w:r>
         <w:rPr>
+          <w:rFonts w:ascii="Calibri" w:hAnsi="Calibri" w:eastAsia="ＭＳ ゴシック" w:cs="Calibri" w:asciiTheme="majorHAnsi" w:hAnsiTheme="majorHAnsi" w:eastAsiaTheme="majorEastAsia" w:csTheme="majorBidi"/>
           <w:b/>
+          <w:bCs/>
+          <w:color w:val="365F91" w:themeColor="accent1" w:themeShade="bf"/>
+          <w:kern w:val="0"/>
           <w:sz w:val="36"/>
+          <w:szCs w:val="28"/>
         </w:rPr>
         <w:t>과학 탐구 수행평가</w:t>
       </w:r>
       <w:r>
         <w:rPr>
+          <w:rFonts w:ascii="Calibri" w:hAnsi="Calibri" w:eastAsia="ＭＳ ゴシック" w:cs="Calibri" w:asciiTheme="majorHAnsi" w:hAnsiTheme="majorHAnsi" w:eastAsiaTheme="majorEastAsia" w:csTheme="majorBidi"/>
           <w:b/>
+          <w:bCs/>
+          <w:color w:val="365F91" w:themeColor="accent1" w:themeShade="bf"/>
+          <w:kern w:val="0"/>
           <w:sz w:val="36"/>
+          <w:szCs w:val="28"/>
         </w:rPr>
         <w:t>] AI</w:t>
       </w:r>
       <w:r>
         <w:rPr>
+          <w:rFonts w:ascii="Calibri" w:hAnsi="Calibri" w:eastAsia="ＭＳ ゴシック" w:cs="Calibri" w:asciiTheme="majorHAnsi" w:hAnsiTheme="majorHAnsi" w:eastAsiaTheme="majorEastAsia" w:csTheme="majorBidi"/>
           <w:b/>
+          <w:bCs/>
+          <w:color w:val="365F91" w:themeColor="accent1" w:themeShade="bf"/>
+          <w:kern w:val="0"/>
           <w:sz w:val="36"/>
+          <w:szCs w:val="28"/>
         </w:rPr>
         <w:t>로 탐구한 붓꽃의 생물학적 특징과 품종 구별</w:t>
       </w:r>
@@ -42,181 +62,269 @@
     <w:p>
       <w:pPr>
         <w:pStyle w:val="Normal"/>
-        <w:rPr/>
+        <w:jc w:val="left"/>
       </w:pPr>
       <w:r>
         <w:rPr>
+          <w:rFonts w:ascii="Cambria" w:hAnsi="Cambria" w:eastAsia="ＭＳ 明朝" w:cs="Cambria" w:asciiTheme="minorHAnsi" w:hAnsiTheme="minorHAnsi" w:eastAsiaTheme="minorEastAsia" w:csTheme="minorBidi"/>
           <w:b/>
+          <w:bCs/>
           <w:color w:val="333333"/>
+          <w:kern w:val="0"/>
           <w:sz w:val="20"/>
+          <w:szCs w:val="22"/>
         </w:rPr>
         <w:t xml:space="preserve">■ </w:t>
       </w:r>
       <w:r>
         <w:rPr>
+          <w:rFonts w:ascii="Cambria" w:hAnsi="Cambria" w:eastAsia="ＭＳ 明朝" w:cs="Cambria" w:asciiTheme="minorHAnsi" w:hAnsiTheme="minorHAnsi" w:eastAsiaTheme="minorEastAsia" w:csTheme="minorBidi"/>
           <w:b/>
+          <w:bCs/>
           <w:color w:val="333333"/>
+          <w:kern w:val="0"/>
           <w:sz w:val="20"/>
+          <w:szCs w:val="22"/>
         </w:rPr>
         <w:t>학년</w:t>
       </w:r>
       <w:r>
         <w:rPr>
+          <w:rFonts w:ascii="Cambria" w:hAnsi="Cambria" w:eastAsia="ＭＳ 明朝" w:cs="Cambria" w:asciiTheme="minorHAnsi" w:hAnsiTheme="minorHAnsi" w:eastAsiaTheme="minorEastAsia" w:csTheme="minorBidi"/>
           <w:b/>
+          <w:bCs/>
           <w:color w:val="333333"/>
+          <w:kern w:val="0"/>
           <w:sz w:val="20"/>
+          <w:szCs w:val="22"/>
         </w:rPr>
         <w:t>/</w:t>
       </w:r>
       <w:r>
         <w:rPr>
+          <w:rFonts w:ascii="Cambria" w:hAnsi="Cambria" w:eastAsia="ＭＳ 明朝" w:cs="Cambria" w:asciiTheme="minorHAnsi" w:hAnsiTheme="minorHAnsi" w:eastAsiaTheme="minorEastAsia" w:csTheme="minorBidi"/>
           <w:b/>
+          <w:bCs/>
           <w:color w:val="333333"/>
+          <w:kern w:val="0"/>
           <w:sz w:val="20"/>
+          <w:szCs w:val="22"/>
         </w:rPr>
         <w:t>반</w:t>
       </w:r>
       <w:r>
         <w:rPr>
+          <w:rFonts w:ascii="Cambria" w:hAnsi="Cambria" w:eastAsia="ＭＳ 明朝" w:cs="Cambria" w:asciiTheme="minorHAnsi" w:hAnsiTheme="minorHAnsi" w:eastAsiaTheme="minorEastAsia" w:csTheme="minorBidi"/>
           <w:b/>
+          <w:bCs/>
           <w:color w:val="333333"/>
+          <w:kern w:val="0"/>
           <w:sz w:val="20"/>
+          <w:szCs w:val="22"/>
         </w:rPr>
         <w:t>/</w:t>
       </w:r>
       <w:r>
         <w:rPr>
+          <w:rFonts w:ascii="Cambria" w:hAnsi="Cambria" w:eastAsia="ＭＳ 明朝" w:cs="Cambria" w:asciiTheme="minorHAnsi" w:hAnsiTheme="minorHAnsi" w:eastAsiaTheme="minorEastAsia" w:csTheme="minorBidi"/>
           <w:b/>
+          <w:bCs/>
           <w:color w:val="333333"/>
+          <w:kern w:val="0"/>
           <w:sz w:val="20"/>
+          <w:szCs w:val="22"/>
         </w:rPr>
         <w:t>번호</w:t>
       </w:r>
       <w:r>
         <w:rPr>
+          <w:rFonts w:ascii="Cambria" w:hAnsi="Cambria" w:eastAsia="ＭＳ 明朝" w:cs="Cambria" w:asciiTheme="minorHAnsi" w:hAnsiTheme="minorHAnsi" w:eastAsiaTheme="minorEastAsia" w:csTheme="minorBidi"/>
           <w:b/>
+          <w:bCs/>
           <w:color w:val="333333"/>
+          <w:kern w:val="0"/>
           <w:sz w:val="20"/>
+          <w:szCs w:val="22"/>
         </w:rPr>
         <w:t>: 3</w:t>
       </w:r>
       <w:r>
         <w:rPr>
+          <w:rFonts w:ascii="Cambria" w:hAnsi="Cambria" w:eastAsia="ＭＳ 明朝" w:cs="Cambria" w:asciiTheme="minorHAnsi" w:hAnsiTheme="minorHAnsi" w:eastAsiaTheme="minorEastAsia" w:csTheme="minorBidi"/>
           <w:b/>
+          <w:bCs/>
           <w:color w:val="333333"/>
+          <w:kern w:val="0"/>
           <w:sz w:val="20"/>
+          <w:szCs w:val="22"/>
         </w:rPr>
         <w:t xml:space="preserve">학년 </w:t>
       </w:r>
       <w:r>
         <w:rPr>
+          <w:rFonts w:ascii="Cambria" w:hAnsi="Cambria" w:eastAsia="ＭＳ 明朝" w:cs="Cambria" w:asciiTheme="minorHAnsi" w:hAnsiTheme="minorHAnsi" w:eastAsiaTheme="minorEastAsia" w:csTheme="minorBidi"/>
           <w:b/>
+          <w:bCs/>
           <w:color w:val="333333"/>
+          <w:kern w:val="0"/>
           <w:sz w:val="20"/>
+          <w:szCs w:val="22"/>
         </w:rPr>
         <w:t>___</w:t>
       </w:r>
       <w:r>
         <w:rPr>
+          <w:rFonts w:ascii="Cambria" w:hAnsi="Cambria" w:eastAsia="ＭＳ 明朝" w:cs="Cambria" w:asciiTheme="minorHAnsi" w:hAnsiTheme="minorHAnsi" w:eastAsiaTheme="minorEastAsia" w:csTheme="minorBidi"/>
           <w:b/>
+          <w:bCs/>
           <w:color w:val="333333"/>
+          <w:kern w:val="0"/>
           <w:sz w:val="20"/>
+          <w:szCs w:val="22"/>
         </w:rPr>
         <w:t xml:space="preserve">반 </w:t>
       </w:r>
       <w:r>
         <w:rPr>
+          <w:rFonts w:ascii="Cambria" w:hAnsi="Cambria" w:eastAsia="ＭＳ 明朝" w:cs="Cambria" w:asciiTheme="minorHAnsi" w:hAnsiTheme="minorHAnsi" w:eastAsiaTheme="minorEastAsia" w:csTheme="minorBidi"/>
           <w:b/>
+          <w:bCs/>
           <w:color w:val="333333"/>
+          <w:kern w:val="0"/>
           <w:sz w:val="20"/>
+          <w:szCs w:val="22"/>
         </w:rPr>
         <w:t>___</w:t>
       </w:r>
       <w:r>
         <w:rPr>
+          <w:rFonts w:ascii="Cambria" w:hAnsi="Cambria" w:eastAsia="ＭＳ 明朝" w:cs="Cambria" w:asciiTheme="minorHAnsi" w:hAnsiTheme="minorHAnsi" w:eastAsiaTheme="minorEastAsia" w:csTheme="minorBidi"/>
           <w:b/>
+          <w:bCs/>
           <w:color w:val="333333"/>
+          <w:kern w:val="0"/>
           <w:sz w:val="20"/>
+          <w:szCs w:val="22"/>
         </w:rPr>
         <w:t xml:space="preserve">번   </w:t>
       </w:r>
       <w:r>
         <w:rPr>
+          <w:rFonts w:ascii="Cambria" w:hAnsi="Cambria" w:eastAsia="ＭＳ 明朝" w:cs="Cambria" w:asciiTheme="minorHAnsi" w:hAnsiTheme="minorHAnsi" w:eastAsiaTheme="minorEastAsia" w:csTheme="minorBidi"/>
           <w:b/>
+          <w:bCs/>
           <w:color w:val="333333"/>
+          <w:kern w:val="0"/>
           <w:sz w:val="20"/>
+          <w:szCs w:val="22"/>
         </w:rPr>
         <w:t xml:space="preserve">|   </w:t>
       </w:r>
       <w:r>
         <w:rPr>
+          <w:rFonts w:ascii="Cambria" w:hAnsi="Cambria" w:eastAsia="ＭＳ 明朝" w:cs="Cambria" w:asciiTheme="minorHAnsi" w:hAnsiTheme="minorHAnsi" w:eastAsiaTheme="minorEastAsia" w:csTheme="minorBidi"/>
           <w:b/>
+          <w:bCs/>
           <w:color w:val="333333"/>
+          <w:kern w:val="0"/>
           <w:sz w:val="20"/>
+          <w:szCs w:val="22"/>
         </w:rPr>
         <w:t>이름</w:t>
       </w:r>
       <w:r>
         <w:rPr>
+          <w:rFonts w:ascii="Cambria" w:hAnsi="Cambria" w:eastAsia="ＭＳ 明朝" w:cs="Cambria" w:asciiTheme="minorHAnsi" w:hAnsiTheme="minorHAnsi" w:eastAsiaTheme="minorEastAsia" w:csTheme="minorBidi"/>
           <w:b/>
+          <w:bCs/>
           <w:color w:val="333333"/>
+          <w:kern w:val="0"/>
           <w:sz w:val="20"/>
+          <w:szCs w:val="22"/>
         </w:rPr>
         <w:t xml:space="preserve">: _________   |   </w:t>
       </w:r>
       <w:r>
         <w:rPr>
+          <w:rFonts w:ascii="Cambria" w:hAnsi="Cambria" w:eastAsia="ＭＳ 明朝" w:cs="Cambria" w:asciiTheme="minorHAnsi" w:hAnsiTheme="minorHAnsi" w:eastAsiaTheme="minorEastAsia" w:csTheme="minorBidi"/>
           <w:b/>
+          <w:bCs/>
           <w:color w:val="333333"/>
+          <w:kern w:val="0"/>
           <w:sz w:val="20"/>
+          <w:szCs w:val="22"/>
         </w:rPr>
         <w:t>탐구 일자</w:t>
       </w:r>
       <w:r>
         <w:rPr>
+          <w:rFonts w:ascii="Cambria" w:hAnsi="Cambria" w:eastAsia="ＭＳ 明朝" w:cs="Cambria" w:asciiTheme="minorHAnsi" w:hAnsiTheme="minorHAnsi" w:eastAsiaTheme="minorEastAsia" w:csTheme="minorBidi"/>
           <w:b/>
+          <w:bCs/>
           <w:color w:val="333333"/>
+          <w:kern w:val="0"/>
           <w:sz w:val="20"/>
+          <w:szCs w:val="22"/>
         </w:rPr>
         <w:t>: 2026</w:t>
       </w:r>
       <w:r>
         <w:rPr>
+          <w:rFonts w:ascii="Cambria" w:hAnsi="Cambria" w:eastAsia="ＭＳ 明朝" w:cs="Cambria" w:asciiTheme="minorHAnsi" w:hAnsiTheme="minorHAnsi" w:eastAsiaTheme="minorEastAsia" w:csTheme="minorBidi"/>
           <w:b/>
+          <w:bCs/>
           <w:color w:val="333333"/>
+          <w:kern w:val="0"/>
           <w:sz w:val="20"/>
+          <w:szCs w:val="22"/>
         </w:rPr>
         <w:t xml:space="preserve">년 </w:t>
       </w:r>
       <w:r>
         <w:rPr>
+          <w:rFonts w:ascii="Cambria" w:hAnsi="Cambria" w:eastAsia="ＭＳ 明朝" w:cs="Cambria" w:asciiTheme="minorHAnsi" w:hAnsiTheme="minorHAnsi" w:eastAsiaTheme="minorEastAsia" w:csTheme="minorBidi"/>
           <w:b/>
+          <w:bCs/>
           <w:color w:val="333333"/>
+          <w:kern w:val="0"/>
           <w:sz w:val="20"/>
+          <w:szCs w:val="22"/>
         </w:rPr>
         <w:t>8</w:t>
       </w:r>
       <w:r>
         <w:rPr>
+          <w:rFonts w:ascii="Cambria" w:hAnsi="Cambria" w:eastAsia="ＭＳ 明朝" w:cs="Cambria" w:asciiTheme="minorHAnsi" w:hAnsiTheme="minorHAnsi" w:eastAsiaTheme="minorEastAsia" w:csTheme="minorBidi"/>
           <w:b/>
+          <w:bCs/>
           <w:color w:val="333333"/>
+          <w:kern w:val="0"/>
           <w:sz w:val="20"/>
+          <w:szCs w:val="22"/>
         </w:rPr>
         <w:t xml:space="preserve">월 </w:t>
       </w:r>
       <w:r>
         <w:rPr>
+          <w:rFonts w:ascii="Cambria" w:hAnsi="Cambria" w:eastAsia="ＭＳ 明朝" w:cs="Cambria" w:asciiTheme="minorHAnsi" w:hAnsiTheme="minorHAnsi" w:eastAsiaTheme="minorEastAsia" w:csTheme="minorBidi"/>
           <w:b/>
+          <w:bCs/>
           <w:color w:val="333333"/>
+          <w:kern w:val="0"/>
           <w:sz w:val="20"/>
+          <w:szCs w:val="22"/>
         </w:rPr>
         <w:t>27</w:t>
       </w:r>
       <w:r>
         <w:rPr>
+          <w:rFonts w:ascii="Cambria" w:hAnsi="Cambria" w:eastAsia="ＭＳ 明朝" w:cs="Cambria" w:asciiTheme="minorHAnsi" w:hAnsiTheme="minorHAnsi" w:eastAsiaTheme="minorEastAsia" w:csTheme="minorBidi"/>
           <w:b/>
+          <w:bCs/>
           <w:color w:val="333333"/>
+          <w:kern w:val="0"/>
           <w:sz w:val="20"/>
+          <w:szCs w:val="22"/>
         </w:rPr>
         <w:t>일</w:t>
       </w:r>
@@ -227,19 +335,29 @@
         <w:pBdr>
           <w:bottom w:val="single" w:sz="4" w:space="0" w:color="000000"/>
         </w:pBdr>
-        <w:rPr/>
+        <w:jc w:val="left"/>
       </w:pPr>
       <w:r>
         <w:rPr>
+          <w:rFonts w:ascii="Calibri" w:hAnsi="Calibri" w:eastAsia="ＭＳ ゴシック" w:cs="Calibri" w:asciiTheme="majorHAnsi" w:hAnsiTheme="majorHAnsi" w:eastAsiaTheme="majorEastAsia" w:csTheme="majorBidi"/>
           <w:b/>
+          <w:bCs/>
+          <w:color w:val="365F91" w:themeColor="accent1" w:themeShade="bf"/>
+          <w:kern w:val="0"/>
           <w:sz w:val="26"/>
+          <w:szCs w:val="28"/>
         </w:rPr>
         <w:t xml:space="preserve">1. </w:t>
       </w:r>
       <w:r>
         <w:rPr>
+          <w:rFonts w:ascii="Calibri" w:hAnsi="Calibri" w:eastAsia="ＭＳ ゴシック" w:cs="Calibri" w:asciiTheme="majorHAnsi" w:hAnsiTheme="majorHAnsi" w:eastAsiaTheme="majorEastAsia" w:csTheme="majorBidi"/>
           <w:b/>
+          <w:bCs/>
+          <w:color w:val="365F91" w:themeColor="accent1" w:themeShade="bf"/>
+          <w:kern w:val="0"/>
           <w:sz w:val="26"/>
+          <w:szCs w:val="28"/>
         </w:rPr>
         <w:t>탐구 동기 및 궁금한 점</w:t>
       </w:r>
@@ -247,152 +365,28 @@
     <w:p>
       <w:pPr>
         <w:pStyle w:val="Normal"/>
-        <w:rPr/>
+        <w:jc w:val="left"/>
       </w:pPr>
       <w:r>
         <w:rPr>
+          <w:rFonts w:ascii="Cambria" w:hAnsi="Cambria" w:eastAsia="ＭＳ 明朝" w:cs="Cambria" w:asciiTheme="minorHAnsi" w:hAnsiTheme="minorHAnsi" w:eastAsiaTheme="minorEastAsia" w:csTheme="minorBidi"/>
+          <w:kern w:val="0"/>
           <w:sz w:val="20"/>
+          <w:szCs w:val="22"/>
         </w:rPr>
-        <w:t>주변 화단이나 들판에서 볼 수 있는 붓꽃</w:t>
+        <w:t>주변 화단이나 들판에서 볼 수 있는 붓꽃(아이리스)은 꽃잎의 모양과 색깔이 서로 비슷해서 사람이 눈으로 얼핏 보면 어떤 종류인지 구별하기 어렵다.</w:t>
+      </w:r>
+      <w:r>
+        <w:br w:type="textWrapping"/>
       </w:r>
       <w:r>
         <w:rPr>
+          <w:rFonts w:ascii="Cambria" w:hAnsi="Cambria" w:eastAsia="ＭＳ 明朝" w:cs="Cambria" w:asciiTheme="minorHAnsi" w:hAnsiTheme="minorHAnsi" w:eastAsiaTheme="minorEastAsia" w:csTheme="minorBidi"/>
+          <w:kern w:val="0"/>
           <w:sz w:val="20"/>
+          <w:szCs w:val="22"/>
         </w:rPr>
-        <w:t>(</w:t>
-      </w:r>
-      <w:r>
-        <w:rPr>
-          <w:sz w:val="20"/>
-        </w:rPr>
-        <w:t>아이리스</w:t>
-      </w:r>
-      <w:r>
-        <w:rPr>
-          <w:sz w:val="20"/>
-        </w:rPr>
-        <w:t>)</w:t>
-      </w:r>
-      <w:r>
-        <w:rPr>
-          <w:sz w:val="20"/>
-        </w:rPr>
-        <w:t>은 꽃잎의 모양과 색깔이 서로 비슷해서 사람이 눈으로 얼핏 보면 어떤 종류인지 구별하기 어렵다</w:t>
-      </w:r>
-      <w:r>
-        <w:rPr>
-          <w:sz w:val="20"/>
-        </w:rPr>
-        <w:t>.</w:t>
-        <w:br/>
-      </w:r>
-      <w:r>
-        <w:rPr>
-          <w:sz w:val="20"/>
-        </w:rPr>
-        <w:t>식물학자들은 꽃의 각 부위 크기를 측정하여 꽃을 분류하는데</w:t>
-      </w:r>
-      <w:r>
-        <w:rPr>
-          <w:sz w:val="20"/>
-        </w:rPr>
-        <w:t xml:space="preserve">, </w:t>
-      </w:r>
-      <w:r>
-        <w:rPr>
-          <w:sz w:val="20"/>
-        </w:rPr>
-        <w:t xml:space="preserve">과연 </w:t>
-      </w:r>
-      <w:r>
-        <w:rPr>
-          <w:sz w:val="20"/>
-        </w:rPr>
-        <w:t>'</w:t>
-      </w:r>
-      <w:r>
-        <w:rPr>
-          <w:sz w:val="20"/>
-        </w:rPr>
-        <w:t>꽃받침</w:t>
-      </w:r>
-      <w:r>
-        <w:rPr>
-          <w:sz w:val="20"/>
-        </w:rPr>
-        <w:t>'</w:t>
-      </w:r>
-      <w:r>
-        <w:rPr>
-          <w:sz w:val="20"/>
-        </w:rPr>
-        <w:t xml:space="preserve">과 </w:t>
-      </w:r>
-      <w:r>
-        <w:rPr>
-          <w:sz w:val="20"/>
-        </w:rPr>
-        <w:t>'</w:t>
-      </w:r>
-      <w:r>
-        <w:rPr>
-          <w:sz w:val="20"/>
-        </w:rPr>
-        <w:t>꽃잎</w:t>
-      </w:r>
-      <w:r>
-        <w:rPr>
-          <w:sz w:val="20"/>
-        </w:rPr>
-        <w:t xml:space="preserve">' </w:t>
-      </w:r>
-      <w:r>
-        <w:rPr>
-          <w:sz w:val="20"/>
-        </w:rPr>
-        <w:t>중 어떤 부위가 꽃의 종류를 알아맞히는 데 가장 결정적인 힌트가 될까</w:t>
-      </w:r>
-      <w:r>
-        <w:rPr>
-          <w:sz w:val="20"/>
-        </w:rPr>
-        <w:t xml:space="preserve">? </w:t>
-      </w:r>
-      <w:r>
-        <w:rPr>
-          <w:sz w:val="20"/>
-        </w:rPr>
-        <w:t>많은 꽃 데이터를 인공지능</w:t>
-      </w:r>
-      <w:r>
-        <w:rPr>
-          <w:sz w:val="20"/>
-        </w:rPr>
-        <w:t>(AI)</w:t>
-      </w:r>
-      <w:r>
-        <w:rPr>
-          <w:sz w:val="20"/>
-        </w:rPr>
-        <w:t>에게 주고 스스로 관찰하게 하여</w:t>
-      </w:r>
-      <w:r>
-        <w:rPr>
-          <w:sz w:val="20"/>
-        </w:rPr>
-        <w:t>, AI</w:t>
-      </w:r>
-      <w:r>
-        <w:rPr>
-          <w:sz w:val="20"/>
-        </w:rPr>
-        <w:t>가 찾아낸 꽃의 생물학적 규칙을 알아보고자 탐구를 시작했다</w:t>
-      </w:r>
-      <w:r>
-        <w:rPr>
-          <w:sz w:val="20"/>
-        </w:rPr>
-        <w:t>.</w:t>
+        <w:t>식물학자들은 꽃의 각 부위 크기를 측정하여 꽃을 분류하는데, 과연 '꽃받침'과 '꽃잎' 중 어떤 부위가 꽃의 종류를 알아맞히는 데 가장 결정적인 힌트가 될까? 많은 꽃 데이터를 인공지능(AI)에게 주고 스스로 관찰하게 하여, AI가 찾아낸 꽃의 생물학적 규칙을 알아보고자 탐구를 시작했다.</w:t>
       </w:r>
     </w:p>
     <w:p>
@@ -401,61 +395,101 @@
         <w:pBdr>
           <w:bottom w:val="single" w:sz="4" w:space="0" w:color="000000"/>
         </w:pBdr>
-        <w:rPr/>
+        <w:jc w:val="left"/>
       </w:pPr>
       <w:r>
         <w:rPr>
+          <w:rFonts w:ascii="Calibri" w:hAnsi="Calibri" w:eastAsia="ＭＳ ゴシック" w:cs="Calibri" w:asciiTheme="majorHAnsi" w:hAnsiTheme="majorHAnsi" w:eastAsiaTheme="majorEastAsia" w:csTheme="majorBidi"/>
           <w:b/>
+          <w:bCs/>
+          <w:color w:val="365F91" w:themeColor="accent1" w:themeShade="bf"/>
+          <w:kern w:val="0"/>
           <w:sz w:val="26"/>
+          <w:szCs w:val="28"/>
         </w:rPr>
         <w:t xml:space="preserve">2. </w:t>
       </w:r>
       <w:r>
         <w:rPr>
+          <w:rFonts w:ascii="Calibri" w:hAnsi="Calibri" w:eastAsia="ＭＳ ゴシック" w:cs="Calibri" w:asciiTheme="majorHAnsi" w:hAnsiTheme="majorHAnsi" w:eastAsiaTheme="majorEastAsia" w:csTheme="majorBidi"/>
           <w:b/>
+          <w:bCs/>
+          <w:color w:val="365F91" w:themeColor="accent1" w:themeShade="bf"/>
+          <w:kern w:val="0"/>
           <w:sz w:val="26"/>
+          <w:szCs w:val="28"/>
         </w:rPr>
         <w:t>탐구 대상</w:t>
       </w:r>
       <w:r>
         <w:rPr>
+          <w:rFonts w:ascii="Calibri" w:hAnsi="Calibri" w:eastAsia="ＭＳ ゴシック" w:cs="Calibri" w:asciiTheme="majorHAnsi" w:hAnsiTheme="majorHAnsi" w:eastAsiaTheme="majorEastAsia" w:csTheme="majorBidi"/>
           <w:b/>
+          <w:bCs/>
+          <w:color w:val="365F91" w:themeColor="accent1" w:themeShade="bf"/>
+          <w:kern w:val="0"/>
           <w:sz w:val="26"/>
+          <w:szCs w:val="28"/>
         </w:rPr>
         <w:t xml:space="preserve">: </w:t>
       </w:r>
       <w:r>
         <w:rPr>
+          <w:rFonts w:ascii="Calibri" w:hAnsi="Calibri" w:eastAsia="ＭＳ ゴシック" w:cs="Calibri" w:asciiTheme="majorHAnsi" w:hAnsiTheme="majorHAnsi" w:eastAsiaTheme="majorEastAsia" w:csTheme="majorBidi"/>
           <w:b/>
+          <w:bCs/>
+          <w:color w:val="365F91" w:themeColor="accent1" w:themeShade="bf"/>
+          <w:kern w:val="0"/>
           <w:sz w:val="26"/>
+          <w:szCs w:val="28"/>
         </w:rPr>
         <w:t>붓꽃</w:t>
       </w:r>
       <w:r>
         <w:rPr>
+          <w:rFonts w:ascii="Calibri" w:hAnsi="Calibri" w:eastAsia="ＭＳ ゴシック" w:cs="Calibri" w:asciiTheme="majorHAnsi" w:hAnsiTheme="majorHAnsi" w:eastAsiaTheme="majorEastAsia" w:csTheme="majorBidi"/>
           <w:b/>
+          <w:bCs/>
+          <w:color w:val="365F91" w:themeColor="accent1" w:themeShade="bf"/>
+          <w:kern w:val="0"/>
           <w:sz w:val="26"/>
+          <w:szCs w:val="28"/>
         </w:rPr>
         <w:t>(Iris)</w:t>
       </w:r>
       <w:r>
         <w:rPr>
+          <w:rFonts w:ascii="Calibri" w:hAnsi="Calibri" w:eastAsia="ＭＳ ゴシック" w:cs="Calibri" w:asciiTheme="majorHAnsi" w:hAnsiTheme="majorHAnsi" w:eastAsiaTheme="majorEastAsia" w:csTheme="majorBidi"/>
           <w:b/>
+          <w:bCs/>
+          <w:color w:val="365F91" w:themeColor="accent1" w:themeShade="bf"/>
+          <w:kern w:val="0"/>
           <w:sz w:val="26"/>
+          <w:szCs w:val="28"/>
         </w:rPr>
         <w:t xml:space="preserve">의 </w:t>
       </w:r>
       <w:r>
         <w:rPr>
+          <w:rFonts w:ascii="Calibri" w:hAnsi="Calibri" w:eastAsia="ＭＳ ゴシック" w:cs="Calibri" w:asciiTheme="majorHAnsi" w:hAnsiTheme="majorHAnsi" w:eastAsiaTheme="majorEastAsia" w:csTheme="majorBidi"/>
           <w:b/>
+          <w:bCs/>
+          <w:color w:val="365F91" w:themeColor="accent1" w:themeShade="bf"/>
+          <w:kern w:val="0"/>
           <w:sz w:val="26"/>
+          <w:szCs w:val="28"/>
         </w:rPr>
         <w:t>3</w:t>
       </w:r>
       <w:r>
         <w:rPr>
+          <w:rFonts w:ascii="Calibri" w:hAnsi="Calibri" w:eastAsia="ＭＳ ゴシック" w:cs="Calibri" w:asciiTheme="majorHAnsi" w:hAnsiTheme="majorHAnsi" w:eastAsiaTheme="majorEastAsia" w:csTheme="majorBidi"/>
           <w:b/>
+          <w:bCs/>
+          <w:color w:val="365F91" w:themeColor="accent1" w:themeShade="bf"/>
+          <w:kern w:val="0"/>
           <w:sz w:val="26"/>
+          <w:szCs w:val="28"/>
         </w:rPr>
         <w:t>가지 품종과 관찰 부위</w:t>
       </w:r>
@@ -463,77 +497,113 @@
     <w:p>
       <w:pPr>
         <w:pStyle w:val="Normal"/>
-        <w:rPr/>
+        <w:jc w:val="left"/>
       </w:pPr>
       <w:r>
         <w:rPr>
+          <w:rFonts w:ascii="Cambria" w:hAnsi="Cambria" w:eastAsia="ＭＳ 明朝" w:cs="Cambria" w:asciiTheme="minorHAnsi" w:hAnsiTheme="minorHAnsi" w:eastAsiaTheme="minorEastAsia" w:csTheme="minorBidi"/>
+          <w:kern w:val="0"/>
           <w:sz w:val="20"/>
+          <w:szCs w:val="22"/>
         </w:rPr>
         <w:t xml:space="preserve">이번 탐구에서 관찰한 대상은 총 </w:t>
       </w:r>
       <w:r>
         <w:rPr>
+          <w:rFonts w:ascii="Cambria" w:hAnsi="Cambria" w:eastAsia="ＭＳ 明朝" w:cs="Cambria" w:asciiTheme="minorHAnsi" w:hAnsiTheme="minorHAnsi" w:eastAsiaTheme="minorEastAsia" w:csTheme="minorBidi"/>
+          <w:kern w:val="0"/>
           <w:sz w:val="20"/>
+          <w:szCs w:val="22"/>
         </w:rPr>
         <w:t>150</w:t>
       </w:r>
       <w:r>
         <w:rPr>
+          <w:rFonts w:ascii="Cambria" w:hAnsi="Cambria" w:eastAsia="ＭＳ 明朝" w:cs="Cambria" w:asciiTheme="minorHAnsi" w:hAnsiTheme="minorHAnsi" w:eastAsiaTheme="minorEastAsia" w:csTheme="minorBidi"/>
+          <w:kern w:val="0"/>
           <w:sz w:val="20"/>
+          <w:szCs w:val="22"/>
         </w:rPr>
         <w:t>송이의 붓꽃이며</w:t>
       </w:r>
       <w:r>
         <w:rPr>
+          <w:rFonts w:ascii="Cambria" w:hAnsi="Cambria" w:eastAsia="ＭＳ 明朝" w:cs="Cambria" w:asciiTheme="minorHAnsi" w:hAnsiTheme="minorHAnsi" w:eastAsiaTheme="minorEastAsia" w:csTheme="minorBidi"/>
+          <w:kern w:val="0"/>
           <w:sz w:val="20"/>
+          <w:szCs w:val="22"/>
         </w:rPr>
         <w:t>, 3</w:t>
       </w:r>
       <w:r>
         <w:rPr>
+          <w:rFonts w:ascii="Cambria" w:hAnsi="Cambria" w:eastAsia="ＭＳ 明朝" w:cs="Cambria" w:asciiTheme="minorHAnsi" w:hAnsiTheme="minorHAnsi" w:eastAsiaTheme="minorEastAsia" w:csTheme="minorBidi"/>
+          <w:kern w:val="0"/>
           <w:sz w:val="20"/>
+          <w:szCs w:val="22"/>
         </w:rPr>
         <w:t>가지 서로 다른 품종으로 구성되어 있다</w:t>
       </w:r>
       <w:r>
         <w:rPr>
+          <w:rFonts w:ascii="Cambria" w:hAnsi="Cambria" w:eastAsia="ＭＳ 明朝" w:cs="Cambria" w:asciiTheme="minorHAnsi" w:hAnsiTheme="minorHAnsi" w:eastAsiaTheme="minorEastAsia" w:csTheme="minorBidi"/>
+          <w:kern w:val="0"/>
           <w:sz w:val="20"/>
+          <w:szCs w:val="22"/>
         </w:rPr>
         <w:t xml:space="preserve">. </w:t>
       </w:r>
       <w:r>
         <w:rPr>
+          <w:rFonts w:ascii="Cambria" w:hAnsi="Cambria" w:eastAsia="ＭＳ 明朝" w:cs="Cambria" w:asciiTheme="minorHAnsi" w:hAnsiTheme="minorHAnsi" w:eastAsiaTheme="minorEastAsia" w:csTheme="minorBidi"/>
+          <w:kern w:val="0"/>
           <w:sz w:val="20"/>
+          <w:szCs w:val="22"/>
         </w:rPr>
         <w:t xml:space="preserve">각 꽃마다 </w:t>
       </w:r>
       <w:r>
         <w:rPr>
+          <w:rFonts w:ascii="Cambria" w:hAnsi="Cambria" w:eastAsia="ＭＳ 明朝" w:cs="Cambria" w:asciiTheme="minorHAnsi" w:hAnsiTheme="minorHAnsi" w:eastAsiaTheme="minorEastAsia" w:csTheme="minorBidi"/>
+          <w:kern w:val="0"/>
           <w:sz w:val="20"/>
+          <w:szCs w:val="22"/>
         </w:rPr>
         <w:t>4</w:t>
       </w:r>
       <w:r>
         <w:rPr>
+          <w:rFonts w:ascii="Cambria" w:hAnsi="Cambria" w:eastAsia="ＭＳ 明朝" w:cs="Cambria" w:asciiTheme="minorHAnsi" w:hAnsiTheme="minorHAnsi" w:eastAsiaTheme="minorEastAsia" w:csTheme="minorBidi"/>
+          <w:kern w:val="0"/>
           <w:sz w:val="20"/>
+          <w:szCs w:val="22"/>
         </w:rPr>
         <w:t>가지 부위의 크기</w:t>
       </w:r>
       <w:r>
         <w:rPr>
+          <w:rFonts w:ascii="Cambria" w:hAnsi="Cambria" w:eastAsia="ＭＳ 明朝" w:cs="Cambria" w:asciiTheme="minorHAnsi" w:hAnsiTheme="minorHAnsi" w:eastAsiaTheme="minorEastAsia" w:csTheme="minorBidi"/>
+          <w:kern w:val="0"/>
           <w:sz w:val="20"/>
+          <w:szCs w:val="22"/>
         </w:rPr>
         <w:t>(cm)</w:t>
       </w:r>
       <w:r>
         <w:rPr>
+          <w:rFonts w:ascii="Cambria" w:hAnsi="Cambria" w:eastAsia="ＭＳ 明朝" w:cs="Cambria" w:asciiTheme="minorHAnsi" w:hAnsiTheme="minorHAnsi" w:eastAsiaTheme="minorEastAsia" w:csTheme="minorBidi"/>
+          <w:kern w:val="0"/>
           <w:sz w:val="20"/>
+          <w:szCs w:val="22"/>
         </w:rPr>
         <w:t>를 측정했다</w:t>
       </w:r>
       <w:r>
         <w:rPr>
+          <w:rFonts w:ascii="Cambria" w:hAnsi="Cambria" w:eastAsia="ＭＳ 明朝" w:cs="Cambria" w:asciiTheme="minorHAnsi" w:hAnsiTheme="minorHAnsi" w:eastAsiaTheme="minorEastAsia" w:csTheme="minorBidi"/>
+          <w:kern w:val="0"/>
           <w:sz w:val="20"/>
+          <w:szCs w:val="22"/>
         </w:rPr>
         <w:t>.</w:t>
       </w:r>
@@ -544,6 +614,14 @@
         <w:tblW w:w="8640" w:type="dxa"/>
         <w:jc w:val="left"/>
         <w:tblInd w:w="0" w:type="dxa"/>
+        <w:tblBorders>
+          <w:top w:val="single" w:sz="4" w:space="0" w:color="auto"/>
+          <w:left w:val="single" w:sz="4" w:space="0" w:color="auto"/>
+          <w:bottom w:val="single" w:sz="4" w:space="0" w:color="auto"/>
+          <w:right w:val="single" w:sz="4" w:space="0" w:color="auto"/>
+          <w:insideH w:val="single" w:sz="4" w:space="0" w:color="auto"/>
+          <w:insideV w:val="single" w:sz="4" w:space="0" w:color="auto"/>
+        </w:tblBorders>
         <w:tblLayout w:type="fixed"/>
         <w:tblCellMar>
           <w:top w:w="0" w:type="dxa"/>
@@ -551,7 +629,7 @@
           <w:bottom w:w="0" w:type="dxa"/>
           <w:right w:w="108" w:type="dxa"/>
         </w:tblCellMar>
-        <w:tblLook w:val="04a0" w:noHBand="0" w:noVBand="1" w:firstColumn="1" w:lastRow="0" w:lastColumn="0" w:firstRow="1"/>
+        <w:tblLook w:firstRow="1" w:firstColumn="1" w:noVBand="1"/>
       </w:tblPr>
       <w:tblGrid>
         <w:gridCol w:w="2880"/>
@@ -559,37 +637,46 @@
         <w:gridCol w:w="2880"/>
       </w:tblGrid>
       <w:tr>
-        <w:trPr/>
         <w:tc>
           <w:tcPr>
             <w:tcW w:w="2880" w:type="dxa"/>
-            <w:tcBorders/>
-            <w:shd w:color="auto" w:fill="FFFFFF" w:val="clear"/>
+            <w:tcBorders>
+              <w:top w:val="single" w:sz="4" w:space="0" w:color="auto"/>
+              <w:left w:val="single" w:sz="4" w:space="0" w:color="auto"/>
+              <w:bottom w:val="single" w:sz="4" w:space="0" w:color="auto"/>
+              <w:right w:val="single" w:sz="4" w:space="0" w:color="auto"/>
+            </w:tcBorders>
+            <w:shd w:val="clear" w:fill="FFFFFF"/>
+            <w:tcMar>
+              <w:top w:w="0" w:type="dxa"/>
+              <w:left w:w="108" w:type="dxa"/>
+              <w:bottom w:w="0" w:type="dxa"/>
+              <w:right w:w="108" w:type="dxa"/>
+            </w:tcMar>
           </w:tcPr>
           <w:p>
             <w:pPr>
               <w:pStyle w:val="Normal"/>
               <w:widowControl/>
-              <w:spacing w:lineRule="auto" w:line="240" w:before="0" w:after="0"/>
+              <w:spacing w:before="0" w:after="0" w:line="240" w:lineRule="auto"/>
               <w:jc w:val="left"/>
               <w:rPr>
-                <w:rFonts w:ascii="Cambria" w:hAnsi="Cambria" w:eastAsia="ＭＳ 明朝" w:cs=""/>
+                <w:rFonts w:ascii="Cambria" w:hAnsi="Cambria" w:eastAsia="ＭＳ 明朝"/>
                 <w:color w:val="000000"/>
                 <w:kern w:val="0"/>
                 <w:sz w:val="22"/>
                 <w:szCs w:val="22"/>
-                <w:lang w:val="en-US" w:eastAsia="en-US" w:bidi="ar-SA"/>
               </w:rPr>
             </w:pPr>
             <w:r>
               <w:rPr>
-                <w:rFonts w:ascii="Cambria" w:hAnsi="Cambria" w:cs=""/>
+                <w:rFonts w:ascii="Cambria" w:hAnsi="Cambria" w:eastAsia="ＭＳ 明朝" w:cs="Cambria" w:eastAsiaTheme="minorEastAsia"/>
                 <w:b/>
+                <w:bCs/>
                 <w:color w:val="000000"/>
                 <w:kern w:val="0"/>
                 <w:sz w:val="22"/>
                 <w:szCs w:val="22"/>
-                <w:lang w:val="en-US" w:eastAsia="en-US" w:bidi="ar-SA"/>
               </w:rPr>
               <w:t>구분</w:t>
             </w:r>
@@ -598,57 +685,67 @@
         <w:tc>
           <w:tcPr>
             <w:tcW w:w="2880" w:type="dxa"/>
-            <w:tcBorders/>
-            <w:shd w:color="auto" w:fill="FFFFFF" w:val="clear"/>
+            <w:tcBorders>
+              <w:top w:val="single" w:sz="4" w:space="0" w:color="auto"/>
+              <w:left w:val="single" w:sz="4" w:space="0" w:color="auto"/>
+              <w:bottom w:val="single" w:sz="4" w:space="0" w:color="auto"/>
+              <w:right w:val="single" w:sz="4" w:space="0" w:color="auto"/>
+            </w:tcBorders>
+            <w:shd w:val="clear" w:fill="FFFFFF"/>
+            <w:tcMar>
+              <w:top w:w="0" w:type="dxa"/>
+              <w:left w:w="108" w:type="dxa"/>
+              <w:bottom w:w="0" w:type="dxa"/>
+              <w:right w:w="108" w:type="dxa"/>
+            </w:tcMar>
           </w:tcPr>
           <w:p>
             <w:pPr>
               <w:pStyle w:val="Normal"/>
               <w:widowControl/>
-              <w:spacing w:lineRule="auto" w:line="240" w:before="0" w:after="0"/>
+              <w:spacing w:before="0" w:after="0" w:line="240" w:lineRule="auto"/>
               <w:jc w:val="left"/>
               <w:rPr>
-                <w:rFonts w:ascii="Cambria" w:hAnsi="Cambria" w:eastAsia="ＭＳ 明朝" w:cs=""/>
+                <w:rFonts w:ascii="Cambria" w:hAnsi="Cambria" w:eastAsia="ＭＳ 明朝"/>
                 <w:color w:val="000000"/>
                 <w:kern w:val="0"/>
                 <w:sz w:val="22"/>
                 <w:szCs w:val="22"/>
-                <w:lang w:val="en-US" w:eastAsia="en-US" w:bidi="ar-SA"/>
               </w:rPr>
             </w:pPr>
             <w:r>
               <w:rPr>
-                <w:rFonts w:ascii="Cambria" w:hAnsi="Cambria" w:cs=""/>
+                <w:rFonts w:ascii="Cambria" w:hAnsi="Cambria" w:eastAsia="ＭＳ 明朝" w:cs="Cambria" w:eastAsiaTheme="minorEastAsia"/>
                 <w:b/>
+                <w:bCs/>
                 <w:color w:val="000000"/>
                 <w:kern w:val="0"/>
                 <w:sz w:val="22"/>
                 <w:szCs w:val="22"/>
-                <w:lang w:val="en-US" w:eastAsia="en-US" w:bidi="ar-SA"/>
               </w:rPr>
               <w:t xml:space="preserve">이름 </w:t>
             </w:r>
             <w:r>
               <w:rPr>
-                <w:rFonts w:eastAsia="ＭＳ 明朝" w:cs=""/>
+                <w:rFonts w:ascii="Cambria" w:hAnsi="Cambria" w:eastAsia="ＭＳ 明朝" w:cs="Cambria" w:asciiTheme="minorHAnsi" w:hAnsiTheme="minorHAnsi"/>
                 <w:b/>
+                <w:bCs/>
                 <w:color w:val="000000"/>
                 <w:kern w:val="0"/>
                 <w:sz w:val="22"/>
                 <w:szCs w:val="22"/>
-                <w:lang w:val="en-US" w:eastAsia="en-US" w:bidi="ar-SA"/>
               </w:rPr>
               <w:t xml:space="preserve">/ </w:t>
             </w:r>
             <w:r>
               <w:rPr>
-                <w:rFonts w:ascii="Cambria" w:hAnsi="Cambria" w:cs=""/>
+                <w:rFonts w:ascii="Cambria" w:hAnsi="Cambria" w:eastAsia="ＭＳ 明朝" w:cs="Cambria" w:eastAsiaTheme="minorEastAsia"/>
                 <w:b/>
+                <w:bCs/>
                 <w:color w:val="000000"/>
                 <w:kern w:val="0"/>
                 <w:sz w:val="22"/>
                 <w:szCs w:val="22"/>
-                <w:lang w:val="en-US" w:eastAsia="en-US" w:bidi="ar-SA"/>
               </w:rPr>
               <w:t>측정 항목</w:t>
             </w:r>
@@ -657,33 +754,43 @@
         <w:tc>
           <w:tcPr>
             <w:tcW w:w="2880" w:type="dxa"/>
-            <w:tcBorders/>
-            <w:shd w:color="auto" w:fill="FFFFFF" w:val="clear"/>
+            <w:tcBorders>
+              <w:top w:val="single" w:sz="4" w:space="0" w:color="auto"/>
+              <w:left w:val="single" w:sz="4" w:space="0" w:color="auto"/>
+              <w:bottom w:val="single" w:sz="4" w:space="0" w:color="auto"/>
+              <w:right w:val="single" w:sz="4" w:space="0" w:color="auto"/>
+            </w:tcBorders>
+            <w:shd w:val="clear" w:fill="FFFFFF"/>
+            <w:tcMar>
+              <w:top w:w="0" w:type="dxa"/>
+              <w:left w:w="108" w:type="dxa"/>
+              <w:bottom w:w="0" w:type="dxa"/>
+              <w:right w:w="108" w:type="dxa"/>
+            </w:tcMar>
           </w:tcPr>
           <w:p>
             <w:pPr>
               <w:pStyle w:val="Normal"/>
               <w:widowControl/>
-              <w:spacing w:lineRule="auto" w:line="240" w:before="0" w:after="0"/>
+              <w:spacing w:before="0" w:after="0" w:line="240" w:lineRule="auto"/>
               <w:jc w:val="left"/>
               <w:rPr>
-                <w:rFonts w:ascii="Cambria" w:hAnsi="Cambria" w:eastAsia="ＭＳ 明朝" w:cs=""/>
+                <w:rFonts w:ascii="Cambria" w:hAnsi="Cambria" w:eastAsia="ＭＳ 明朝"/>
                 <w:color w:val="000000"/>
                 <w:kern w:val="0"/>
                 <w:sz w:val="22"/>
                 <w:szCs w:val="22"/>
-                <w:lang w:val="en-US" w:eastAsia="en-US" w:bidi="ar-SA"/>
               </w:rPr>
             </w:pPr>
             <w:r>
               <w:rPr>
-                <w:rFonts w:ascii="Cambria" w:hAnsi="Cambria" w:cs=""/>
+                <w:rFonts w:ascii="Cambria" w:hAnsi="Cambria" w:eastAsia="ＭＳ 明朝" w:cs="Cambria" w:eastAsiaTheme="minorEastAsia"/>
                 <w:b/>
+                <w:bCs/>
                 <w:color w:val="000000"/>
                 <w:kern w:val="0"/>
                 <w:sz w:val="22"/>
                 <w:szCs w:val="22"/>
-                <w:lang w:val="en-US" w:eastAsia="en-US" w:bidi="ar-SA"/>
               </w:rPr>
               <w:t>생물학적 특징 및 설명</w:t>
             </w:r>
@@ -691,34 +798,42 @@
         </w:tc>
       </w:tr>
       <w:tr>
-        <w:trPr/>
         <w:tc>
           <w:tcPr>
             <w:tcW w:w="2880" w:type="dxa"/>
-            <w:tcBorders/>
-            <w:shd w:color="auto" w:fill="F1F8E9" w:val="clear"/>
+            <w:tcBorders>
+              <w:top w:val="single" w:sz="4" w:space="0" w:color="auto"/>
+              <w:left w:val="single" w:sz="4" w:space="0" w:color="auto"/>
+              <w:bottom w:val="single" w:sz="4" w:space="0" w:color="auto"/>
+              <w:right w:val="single" w:sz="4" w:space="0" w:color="auto"/>
+            </w:tcBorders>
+            <w:shd w:val="clear" w:fill="F1F8E9"/>
+            <w:tcMar>
+              <w:top w:w="0" w:type="dxa"/>
+              <w:left w:w="108" w:type="dxa"/>
+              <w:bottom w:w="0" w:type="dxa"/>
+              <w:right w:w="108" w:type="dxa"/>
+            </w:tcMar>
           </w:tcPr>
           <w:p>
             <w:pPr>
               <w:pStyle w:val="Normal"/>
               <w:widowControl/>
-              <w:spacing w:lineRule="auto" w:line="240" w:before="0" w:after="0"/>
+              <w:spacing w:before="0" w:after="0" w:line="240" w:lineRule="auto"/>
               <w:jc w:val="left"/>
               <w:rPr>
-                <w:rFonts w:ascii="Cambria" w:hAnsi="Cambria" w:eastAsia="ＭＳ 明朝" w:cs=""/>
+                <w:rFonts w:ascii="Cambria" w:hAnsi="Cambria" w:eastAsia="ＭＳ 明朝"/>
                 <w:kern w:val="0"/>
                 <w:sz w:val="22"/>
                 <w:szCs w:val="22"/>
-                <w:lang w:val="en-US" w:eastAsia="en-US" w:bidi="ar-SA"/>
               </w:rPr>
             </w:pPr>
             <w:r>
               <w:rPr>
-                <w:rFonts w:ascii="Cambria" w:hAnsi="Cambria" w:cs=""/>
+                <w:rFonts w:ascii="Cambria" w:hAnsi="Cambria" w:eastAsia="ＭＳ 明朝" w:cs="Cambria" w:eastAsiaTheme="minorEastAsia"/>
                 <w:kern w:val="0"/>
                 <w:sz w:val="22"/>
                 <w:szCs w:val="22"/>
-                <w:lang w:val="en-US" w:eastAsia="en-US" w:bidi="ar-SA"/>
               </w:rPr>
               <w:t>관찰한 꽃 품종</w:t>
             </w:r>
@@ -727,40 +842,48 @@
         <w:tc>
           <w:tcPr>
             <w:tcW w:w="2880" w:type="dxa"/>
-            <w:tcBorders/>
-            <w:shd w:color="auto" w:fill="F1F8E9" w:val="clear"/>
+            <w:tcBorders>
+              <w:top w:val="single" w:sz="4" w:space="0" w:color="auto"/>
+              <w:left w:val="single" w:sz="4" w:space="0" w:color="auto"/>
+              <w:bottom w:val="single" w:sz="4" w:space="0" w:color="auto"/>
+              <w:right w:val="single" w:sz="4" w:space="0" w:color="auto"/>
+            </w:tcBorders>
+            <w:shd w:val="clear" w:fill="F1F8E9"/>
+            <w:tcMar>
+              <w:top w:w="0" w:type="dxa"/>
+              <w:left w:w="108" w:type="dxa"/>
+              <w:bottom w:w="0" w:type="dxa"/>
+              <w:right w:w="108" w:type="dxa"/>
+            </w:tcMar>
           </w:tcPr>
           <w:p>
             <w:pPr>
               <w:pStyle w:val="Normal"/>
               <w:widowControl/>
-              <w:spacing w:lineRule="auto" w:line="240" w:before="0" w:after="0"/>
+              <w:spacing w:before="0" w:after="0" w:line="240" w:lineRule="auto"/>
               <w:jc w:val="left"/>
               <w:rPr>
-                <w:rFonts w:ascii="Cambria" w:hAnsi="Cambria" w:eastAsia="ＭＳ 明朝" w:cs=""/>
+                <w:rFonts w:ascii="Cambria" w:hAnsi="Cambria" w:eastAsia="ＭＳ 明朝"/>
                 <w:kern w:val="0"/>
                 <w:sz w:val="22"/>
                 <w:szCs w:val="22"/>
-                <w:lang w:val="en-US" w:eastAsia="en-US" w:bidi="ar-SA"/>
               </w:rPr>
             </w:pPr>
             <w:r>
               <w:rPr>
-                <w:rFonts w:ascii="Cambria" w:hAnsi="Cambria" w:cs=""/>
+                <w:rFonts w:ascii="Cambria" w:hAnsi="Cambria" w:eastAsia="ＭＳ 明朝" w:cs="Cambria" w:eastAsiaTheme="minorEastAsia"/>
                 <w:kern w:val="0"/>
                 <w:sz w:val="22"/>
                 <w:szCs w:val="22"/>
-                <w:lang w:val="en-US" w:eastAsia="en-US" w:bidi="ar-SA"/>
               </w:rPr>
               <w:t xml:space="preserve">세토사 </w:t>
             </w:r>
             <w:r>
               <w:rPr>
-                <w:rFonts w:eastAsia="ＭＳ 明朝" w:cs=""/>
+                <w:rFonts w:ascii="Cambria" w:hAnsi="Cambria" w:eastAsia="ＭＳ 明朝" w:cs="Cambria" w:asciiTheme="minorHAnsi" w:hAnsiTheme="minorHAnsi"/>
                 <w:kern w:val="0"/>
                 <w:sz w:val="22"/>
                 <w:szCs w:val="22"/>
-                <w:lang w:val="en-US" w:eastAsia="en-US" w:bidi="ar-SA"/>
               </w:rPr>
               <w:t>(Setosa)</w:t>
             </w:r>
@@ -769,30 +892,39 @@
         <w:tc>
           <w:tcPr>
             <w:tcW w:w="2880" w:type="dxa"/>
-            <w:tcBorders/>
-            <w:shd w:color="auto" w:fill="F1F8E9" w:val="clear"/>
+            <w:tcBorders>
+              <w:top w:val="single" w:sz="4" w:space="0" w:color="auto"/>
+              <w:left w:val="single" w:sz="4" w:space="0" w:color="auto"/>
+              <w:bottom w:val="single" w:sz="4" w:space="0" w:color="auto"/>
+              <w:right w:val="single" w:sz="4" w:space="0" w:color="auto"/>
+            </w:tcBorders>
+            <w:shd w:val="clear" w:fill="F1F8E9"/>
+            <w:tcMar>
+              <w:top w:w="0" w:type="dxa"/>
+              <w:left w:w="108" w:type="dxa"/>
+              <w:bottom w:w="0" w:type="dxa"/>
+              <w:right w:w="108" w:type="dxa"/>
+            </w:tcMar>
           </w:tcPr>
           <w:p>
             <w:pPr>
               <w:pStyle w:val="Normal"/>
               <w:widowControl/>
-              <w:spacing w:lineRule="auto" w:line="240" w:before="0" w:after="0"/>
+              <w:spacing w:before="0" w:after="0" w:line="240" w:lineRule="auto"/>
               <w:jc w:val="left"/>
               <w:rPr>
-                <w:rFonts w:ascii="Cambria" w:hAnsi="Cambria" w:eastAsia="ＭＳ 明朝" w:cs=""/>
+                <w:rFonts w:ascii="Cambria" w:hAnsi="Cambria" w:eastAsia="ＭＳ 明朝"/>
                 <w:kern w:val="0"/>
                 <w:sz w:val="22"/>
                 <w:szCs w:val="22"/>
-                <w:lang w:val="en-US" w:eastAsia="en-US" w:bidi="ar-SA"/>
               </w:rPr>
             </w:pPr>
             <w:r>
               <w:rPr>
-                <w:rFonts w:ascii="Cambria" w:hAnsi="Cambria" w:cs=""/>
+                <w:rFonts w:ascii="Cambria" w:hAnsi="Cambria" w:eastAsia="ＭＳ 明朝" w:cs="Cambria" w:eastAsiaTheme="minorEastAsia"/>
                 <w:kern w:val="0"/>
                 <w:sz w:val="22"/>
                 <w:szCs w:val="22"/>
-                <w:lang w:val="en-US" w:eastAsia="en-US" w:bidi="ar-SA"/>
               </w:rPr>
               <w:t>꽃잎이 다른 품종에 비해 매우 작고 아담한 붓꽃</w:t>
             </w:r>
@@ -800,34 +932,42 @@
         </w:tc>
       </w:tr>
       <w:tr>
-        <w:trPr/>
         <w:tc>
           <w:tcPr>
             <w:tcW w:w="2880" w:type="dxa"/>
-            <w:tcBorders/>
-            <w:shd w:color="auto" w:fill="FFFFFF" w:val="clear"/>
+            <w:tcBorders>
+              <w:top w:val="single" w:sz="4" w:space="0" w:color="auto"/>
+              <w:left w:val="single" w:sz="4" w:space="0" w:color="auto"/>
+              <w:bottom w:val="single" w:sz="4" w:space="0" w:color="auto"/>
+              <w:right w:val="single" w:sz="4" w:space="0" w:color="auto"/>
+            </w:tcBorders>
+            <w:shd w:val="clear" w:fill="FFFFFF"/>
+            <w:tcMar>
+              <w:top w:w="0" w:type="dxa"/>
+              <w:left w:w="108" w:type="dxa"/>
+              <w:bottom w:w="0" w:type="dxa"/>
+              <w:right w:w="108" w:type="dxa"/>
+            </w:tcMar>
           </w:tcPr>
           <w:p>
             <w:pPr>
               <w:pStyle w:val="Normal"/>
               <w:widowControl/>
-              <w:spacing w:lineRule="auto" w:line="240" w:before="0" w:after="0"/>
+              <w:spacing w:before="0" w:after="0" w:line="240" w:lineRule="auto"/>
               <w:jc w:val="left"/>
               <w:rPr>
-                <w:rFonts w:ascii="Cambria" w:hAnsi="Cambria" w:eastAsia="ＭＳ 明朝" w:cs=""/>
+                <w:rFonts w:ascii="Cambria" w:hAnsi="Cambria" w:eastAsia="ＭＳ 明朝"/>
                 <w:kern w:val="0"/>
                 <w:sz w:val="22"/>
                 <w:szCs w:val="22"/>
-                <w:lang w:val="en-US" w:eastAsia="en-US" w:bidi="ar-SA"/>
               </w:rPr>
             </w:pPr>
             <w:r>
               <w:rPr>
-                <w:rFonts w:ascii="Cambria" w:hAnsi="Cambria" w:cs=""/>
+                <w:rFonts w:ascii="Cambria" w:hAnsi="Cambria" w:eastAsia="ＭＳ 明朝" w:cs="Cambria" w:eastAsiaTheme="minorEastAsia"/>
                 <w:kern w:val="0"/>
                 <w:sz w:val="22"/>
                 <w:szCs w:val="22"/>
-                <w:lang w:val="en-US" w:eastAsia="en-US" w:bidi="ar-SA"/>
               </w:rPr>
               <w:t>관찰한 꽃 품종</w:t>
             </w:r>
@@ -836,40 +976,48 @@
         <w:tc>
           <w:tcPr>
             <w:tcW w:w="2880" w:type="dxa"/>
-            <w:tcBorders/>
-            <w:shd w:color="auto" w:fill="FFFFFF" w:val="clear"/>
+            <w:tcBorders>
+              <w:top w:val="single" w:sz="4" w:space="0" w:color="auto"/>
+              <w:left w:val="single" w:sz="4" w:space="0" w:color="auto"/>
+              <w:bottom w:val="single" w:sz="4" w:space="0" w:color="auto"/>
+              <w:right w:val="single" w:sz="4" w:space="0" w:color="auto"/>
+            </w:tcBorders>
+            <w:shd w:val="clear" w:fill="FFFFFF"/>
+            <w:tcMar>
+              <w:top w:w="0" w:type="dxa"/>
+              <w:left w:w="108" w:type="dxa"/>
+              <w:bottom w:w="0" w:type="dxa"/>
+              <w:right w:w="108" w:type="dxa"/>
+            </w:tcMar>
           </w:tcPr>
           <w:p>
             <w:pPr>
               <w:pStyle w:val="Normal"/>
               <w:widowControl/>
-              <w:spacing w:lineRule="auto" w:line="240" w:before="0" w:after="0"/>
+              <w:spacing w:before="0" w:after="0" w:line="240" w:lineRule="auto"/>
               <w:jc w:val="left"/>
               <w:rPr>
-                <w:rFonts w:ascii="Cambria" w:hAnsi="Cambria" w:eastAsia="ＭＳ 明朝" w:cs=""/>
+                <w:rFonts w:ascii="Cambria" w:hAnsi="Cambria" w:eastAsia="ＭＳ 明朝"/>
                 <w:kern w:val="0"/>
                 <w:sz w:val="22"/>
                 <w:szCs w:val="22"/>
-                <w:lang w:val="en-US" w:eastAsia="en-US" w:bidi="ar-SA"/>
               </w:rPr>
             </w:pPr>
             <w:r>
               <w:rPr>
-                <w:rFonts w:ascii="Cambria" w:hAnsi="Cambria" w:cs=""/>
+                <w:rFonts w:ascii="Cambria" w:hAnsi="Cambria" w:eastAsia="ＭＳ 明朝" w:cs="Cambria" w:eastAsiaTheme="minorEastAsia"/>
                 <w:kern w:val="0"/>
                 <w:sz w:val="22"/>
                 <w:szCs w:val="22"/>
-                <w:lang w:val="en-US" w:eastAsia="en-US" w:bidi="ar-SA"/>
               </w:rPr>
               <w:t xml:space="preserve">버시칼라 </w:t>
             </w:r>
             <w:r>
               <w:rPr>
-                <w:rFonts w:eastAsia="ＭＳ 明朝" w:cs=""/>
+                <w:rFonts w:ascii="Cambria" w:hAnsi="Cambria" w:eastAsia="ＭＳ 明朝" w:cs="Cambria" w:asciiTheme="minorHAnsi" w:hAnsiTheme="minorHAnsi"/>
                 <w:kern w:val="0"/>
                 <w:sz w:val="22"/>
                 <w:szCs w:val="22"/>
-                <w:lang w:val="en-US" w:eastAsia="en-US" w:bidi="ar-SA"/>
               </w:rPr>
               <w:t>(Versicolor)</w:t>
             </w:r>
@@ -878,30 +1026,39 @@
         <w:tc>
           <w:tcPr>
             <w:tcW w:w="2880" w:type="dxa"/>
-            <w:tcBorders/>
-            <w:shd w:color="auto" w:fill="FFFFFF" w:val="clear"/>
+            <w:tcBorders>
+              <w:top w:val="single" w:sz="4" w:space="0" w:color="auto"/>
+              <w:left w:val="single" w:sz="4" w:space="0" w:color="auto"/>
+              <w:bottom w:val="single" w:sz="4" w:space="0" w:color="auto"/>
+              <w:right w:val="single" w:sz="4" w:space="0" w:color="auto"/>
+            </w:tcBorders>
+            <w:shd w:val="clear" w:fill="FFFFFF"/>
+            <w:tcMar>
+              <w:top w:w="0" w:type="dxa"/>
+              <w:left w:w="108" w:type="dxa"/>
+              <w:bottom w:w="0" w:type="dxa"/>
+              <w:right w:w="108" w:type="dxa"/>
+            </w:tcMar>
           </w:tcPr>
           <w:p>
             <w:pPr>
               <w:pStyle w:val="Normal"/>
               <w:widowControl/>
-              <w:spacing w:lineRule="auto" w:line="240" w:before="0" w:after="0"/>
+              <w:spacing w:before="0" w:after="0" w:line="240" w:lineRule="auto"/>
               <w:jc w:val="left"/>
               <w:rPr>
-                <w:rFonts w:ascii="Cambria" w:hAnsi="Cambria" w:eastAsia="ＭＳ 明朝" w:cs=""/>
+                <w:rFonts w:ascii="Cambria" w:hAnsi="Cambria" w:eastAsia="ＭＳ 明朝"/>
                 <w:kern w:val="0"/>
                 <w:sz w:val="22"/>
                 <w:szCs w:val="22"/>
-                <w:lang w:val="en-US" w:eastAsia="en-US" w:bidi="ar-SA"/>
               </w:rPr>
             </w:pPr>
             <w:r>
               <w:rPr>
-                <w:rFonts w:ascii="Cambria" w:hAnsi="Cambria" w:cs=""/>
+                <w:rFonts w:ascii="Cambria" w:hAnsi="Cambria" w:eastAsia="ＭＳ 明朝" w:cs="Cambria" w:eastAsiaTheme="minorEastAsia"/>
                 <w:kern w:val="0"/>
                 <w:sz w:val="22"/>
                 <w:szCs w:val="22"/>
-                <w:lang w:val="en-US" w:eastAsia="en-US" w:bidi="ar-SA"/>
               </w:rPr>
               <w:t>꽃잎 크기가 중간 정도인 표준적인 붓꽃</w:t>
             </w:r>
@@ -909,34 +1066,42 @@
         </w:tc>
       </w:tr>
       <w:tr>
-        <w:trPr/>
         <w:tc>
           <w:tcPr>
             <w:tcW w:w="2880" w:type="dxa"/>
-            <w:tcBorders/>
-            <w:shd w:color="auto" w:fill="F1F8E9" w:val="clear"/>
+            <w:tcBorders>
+              <w:top w:val="single" w:sz="4" w:space="0" w:color="auto"/>
+              <w:left w:val="single" w:sz="4" w:space="0" w:color="auto"/>
+              <w:bottom w:val="single" w:sz="4" w:space="0" w:color="auto"/>
+              <w:right w:val="single" w:sz="4" w:space="0" w:color="auto"/>
+            </w:tcBorders>
+            <w:shd w:val="clear" w:fill="F1F8E9"/>
+            <w:tcMar>
+              <w:top w:w="0" w:type="dxa"/>
+              <w:left w:w="108" w:type="dxa"/>
+              <w:bottom w:w="0" w:type="dxa"/>
+              <w:right w:w="108" w:type="dxa"/>
+            </w:tcMar>
           </w:tcPr>
           <w:p>
             <w:pPr>
               <w:pStyle w:val="Normal"/>
               <w:widowControl/>
-              <w:spacing w:lineRule="auto" w:line="240" w:before="0" w:after="0"/>
+              <w:spacing w:before="0" w:after="0" w:line="240" w:lineRule="auto"/>
               <w:jc w:val="left"/>
               <w:rPr>
-                <w:rFonts w:ascii="Cambria" w:hAnsi="Cambria" w:eastAsia="ＭＳ 明朝" w:cs=""/>
+                <w:rFonts w:ascii="Cambria" w:hAnsi="Cambria" w:eastAsia="ＭＳ 明朝"/>
                 <w:kern w:val="0"/>
                 <w:sz w:val="22"/>
                 <w:szCs w:val="22"/>
-                <w:lang w:val="en-US" w:eastAsia="en-US" w:bidi="ar-SA"/>
               </w:rPr>
             </w:pPr>
             <w:r>
               <w:rPr>
-                <w:rFonts w:ascii="Cambria" w:hAnsi="Cambria" w:cs=""/>
+                <w:rFonts w:ascii="Cambria" w:hAnsi="Cambria" w:eastAsia="ＭＳ 明朝" w:cs="Cambria" w:eastAsiaTheme="minorEastAsia"/>
                 <w:kern w:val="0"/>
                 <w:sz w:val="22"/>
                 <w:szCs w:val="22"/>
-                <w:lang w:val="en-US" w:eastAsia="en-US" w:bidi="ar-SA"/>
               </w:rPr>
               <w:t>관찰한 꽃 품종</w:t>
             </w:r>
@@ -945,40 +1110,48 @@
         <w:tc>
           <w:tcPr>
             <w:tcW w:w="2880" w:type="dxa"/>
-            <w:tcBorders/>
-            <w:shd w:color="auto" w:fill="F1F8E9" w:val="clear"/>
+            <w:tcBorders>
+              <w:top w:val="single" w:sz="4" w:space="0" w:color="auto"/>
+              <w:left w:val="single" w:sz="4" w:space="0" w:color="auto"/>
+              <w:bottom w:val="single" w:sz="4" w:space="0" w:color="auto"/>
+              <w:right w:val="single" w:sz="4" w:space="0" w:color="auto"/>
+            </w:tcBorders>
+            <w:shd w:val="clear" w:fill="F1F8E9"/>
+            <w:tcMar>
+              <w:top w:w="0" w:type="dxa"/>
+              <w:left w:w="108" w:type="dxa"/>
+              <w:bottom w:w="0" w:type="dxa"/>
+              <w:right w:w="108" w:type="dxa"/>
+            </w:tcMar>
           </w:tcPr>
           <w:p>
             <w:pPr>
               <w:pStyle w:val="Normal"/>
               <w:widowControl/>
-              <w:spacing w:lineRule="auto" w:line="240" w:before="0" w:after="0"/>
+              <w:spacing w:before="0" w:after="0" w:line="240" w:lineRule="auto"/>
               <w:jc w:val="left"/>
               <w:rPr>
-                <w:rFonts w:ascii="Cambria" w:hAnsi="Cambria" w:eastAsia="ＭＳ 明朝" w:cs=""/>
+                <w:rFonts w:ascii="Cambria" w:hAnsi="Cambria" w:eastAsia="ＭＳ 明朝"/>
                 <w:kern w:val="0"/>
                 <w:sz w:val="22"/>
                 <w:szCs w:val="22"/>
-                <w:lang w:val="en-US" w:eastAsia="en-US" w:bidi="ar-SA"/>
               </w:rPr>
             </w:pPr>
             <w:r>
               <w:rPr>
-                <w:rFonts w:ascii="Cambria" w:hAnsi="Cambria" w:cs=""/>
+                <w:rFonts w:ascii="Cambria" w:hAnsi="Cambria" w:eastAsia="ＭＳ 明朝" w:cs="Cambria" w:eastAsiaTheme="minorEastAsia"/>
                 <w:kern w:val="0"/>
                 <w:sz w:val="22"/>
                 <w:szCs w:val="22"/>
-                <w:lang w:val="en-US" w:eastAsia="en-US" w:bidi="ar-SA"/>
               </w:rPr>
               <w:t xml:space="preserve">버지니카 </w:t>
             </w:r>
             <w:r>
               <w:rPr>
-                <w:rFonts w:eastAsia="ＭＳ 明朝" w:cs=""/>
+                <w:rFonts w:ascii="Cambria" w:hAnsi="Cambria" w:eastAsia="ＭＳ 明朝" w:cs="Cambria" w:asciiTheme="minorHAnsi" w:hAnsiTheme="minorHAnsi"/>
                 <w:kern w:val="0"/>
                 <w:sz w:val="22"/>
                 <w:szCs w:val="22"/>
-                <w:lang w:val="en-US" w:eastAsia="en-US" w:bidi="ar-SA"/>
               </w:rPr>
               <w:t>(Virginica)</w:t>
             </w:r>
@@ -987,30 +1160,39 @@
         <w:tc>
           <w:tcPr>
             <w:tcW w:w="2880" w:type="dxa"/>
-            <w:tcBorders/>
-            <w:shd w:color="auto" w:fill="F1F8E9" w:val="clear"/>
+            <w:tcBorders>
+              <w:top w:val="single" w:sz="4" w:space="0" w:color="auto"/>
+              <w:left w:val="single" w:sz="4" w:space="0" w:color="auto"/>
+              <w:bottom w:val="single" w:sz="4" w:space="0" w:color="auto"/>
+              <w:right w:val="single" w:sz="4" w:space="0" w:color="auto"/>
+            </w:tcBorders>
+            <w:shd w:val="clear" w:fill="F1F8E9"/>
+            <w:tcMar>
+              <w:top w:w="0" w:type="dxa"/>
+              <w:left w:w="108" w:type="dxa"/>
+              <w:bottom w:w="0" w:type="dxa"/>
+              <w:right w:w="108" w:type="dxa"/>
+            </w:tcMar>
           </w:tcPr>
           <w:p>
             <w:pPr>
               <w:pStyle w:val="Normal"/>
               <w:widowControl/>
-              <w:spacing w:lineRule="auto" w:line="240" w:before="0" w:after="0"/>
+              <w:spacing w:before="0" w:after="0" w:line="240" w:lineRule="auto"/>
               <w:jc w:val="left"/>
               <w:rPr>
-                <w:rFonts w:ascii="Cambria" w:hAnsi="Cambria" w:eastAsia="ＭＳ 明朝" w:cs=""/>
+                <w:rFonts w:ascii="Cambria" w:hAnsi="Cambria" w:eastAsia="ＭＳ 明朝"/>
                 <w:kern w:val="0"/>
                 <w:sz w:val="22"/>
                 <w:szCs w:val="22"/>
-                <w:lang w:val="en-US" w:eastAsia="en-US" w:bidi="ar-SA"/>
               </w:rPr>
             </w:pPr>
             <w:r>
               <w:rPr>
-                <w:rFonts w:ascii="Cambria" w:hAnsi="Cambria" w:cs=""/>
+                <w:rFonts w:ascii="Cambria" w:hAnsi="Cambria" w:eastAsia="ＭＳ 明朝" w:cs="Cambria" w:eastAsiaTheme="minorEastAsia"/>
                 <w:kern w:val="0"/>
                 <w:sz w:val="22"/>
                 <w:szCs w:val="22"/>
-                <w:lang w:val="en-US" w:eastAsia="en-US" w:bidi="ar-SA"/>
               </w:rPr>
               <w:t>꽃잎이 크고 넓게 자라는 대형 붓꽃</w:t>
             </w:r>
@@ -1018,34 +1200,42 @@
         </w:tc>
       </w:tr>
       <w:tr>
-        <w:trPr/>
         <w:tc>
           <w:tcPr>
             <w:tcW w:w="2880" w:type="dxa"/>
-            <w:tcBorders/>
-            <w:shd w:color="auto" w:fill="FFFFFF" w:val="clear"/>
+            <w:tcBorders>
+              <w:top w:val="single" w:sz="4" w:space="0" w:color="auto"/>
+              <w:left w:val="single" w:sz="4" w:space="0" w:color="auto"/>
+              <w:bottom w:val="single" w:sz="4" w:space="0" w:color="auto"/>
+              <w:right w:val="single" w:sz="4" w:space="0" w:color="auto"/>
+            </w:tcBorders>
+            <w:shd w:val="clear" w:fill="FFFFFF"/>
+            <w:tcMar>
+              <w:top w:w="0" w:type="dxa"/>
+              <w:left w:w="108" w:type="dxa"/>
+              <w:bottom w:w="0" w:type="dxa"/>
+              <w:right w:w="108" w:type="dxa"/>
+            </w:tcMar>
           </w:tcPr>
           <w:p>
             <w:pPr>
               <w:pStyle w:val="Normal"/>
               <w:widowControl/>
-              <w:spacing w:lineRule="auto" w:line="240" w:before="0" w:after="0"/>
+              <w:spacing w:before="0" w:after="0" w:line="240" w:lineRule="auto"/>
               <w:jc w:val="left"/>
               <w:rPr>
-                <w:rFonts w:ascii="Cambria" w:hAnsi="Cambria" w:eastAsia="ＭＳ 明朝" w:cs=""/>
+                <w:rFonts w:ascii="Cambria" w:hAnsi="Cambria" w:eastAsia="ＭＳ 明朝"/>
                 <w:kern w:val="0"/>
                 <w:sz w:val="22"/>
                 <w:szCs w:val="22"/>
-                <w:lang w:val="en-US" w:eastAsia="en-US" w:bidi="ar-SA"/>
               </w:rPr>
             </w:pPr>
             <w:r>
               <w:rPr>
-                <w:rFonts w:ascii="Cambria" w:hAnsi="Cambria" w:cs=""/>
+                <w:rFonts w:ascii="Cambria" w:hAnsi="Cambria" w:eastAsia="ＭＳ 明朝" w:cs="Cambria" w:eastAsiaTheme="minorEastAsia"/>
                 <w:kern w:val="0"/>
                 <w:sz w:val="22"/>
                 <w:szCs w:val="22"/>
-                <w:lang w:val="en-US" w:eastAsia="en-US" w:bidi="ar-SA"/>
               </w:rPr>
               <w:t>측정한 부위</w:t>
             </w:r>
@@ -1054,50 +1244,57 @@
         <w:tc>
           <w:tcPr>
             <w:tcW w:w="2880" w:type="dxa"/>
-            <w:tcBorders/>
-            <w:shd w:color="auto" w:fill="FFFFFF" w:val="clear"/>
+            <w:tcBorders>
+              <w:top w:val="single" w:sz="4" w:space="0" w:color="auto"/>
+              <w:left w:val="single" w:sz="4" w:space="0" w:color="auto"/>
+              <w:bottom w:val="single" w:sz="4" w:space="0" w:color="auto"/>
+              <w:right w:val="single" w:sz="4" w:space="0" w:color="auto"/>
+            </w:tcBorders>
+            <w:shd w:val="clear" w:fill="FFFFFF"/>
+            <w:tcMar>
+              <w:top w:w="0" w:type="dxa"/>
+              <w:left w:w="108" w:type="dxa"/>
+              <w:bottom w:w="0" w:type="dxa"/>
+              <w:right w:w="108" w:type="dxa"/>
+            </w:tcMar>
           </w:tcPr>
           <w:p>
             <w:pPr>
               <w:pStyle w:val="Normal"/>
               <w:widowControl/>
-              <w:spacing w:lineRule="auto" w:line="240" w:before="0" w:after="0"/>
+              <w:spacing w:before="0" w:after="0" w:line="240" w:lineRule="auto"/>
               <w:jc w:val="left"/>
               <w:rPr>
-                <w:rFonts w:ascii="Cambria" w:hAnsi="Cambria" w:eastAsia="ＭＳ 明朝" w:cs=""/>
+                <w:rFonts w:ascii="Cambria" w:hAnsi="Cambria" w:eastAsia="ＭＳ 明朝"/>
                 <w:kern w:val="0"/>
                 <w:sz w:val="22"/>
                 <w:szCs w:val="22"/>
-                <w:lang w:val="en-US" w:eastAsia="en-US" w:bidi="ar-SA"/>
               </w:rPr>
             </w:pPr>
             <w:r>
               <w:rPr>
-                <w:rFonts w:ascii="Cambria" w:hAnsi="Cambria" w:cs=""/>
+                <w:rFonts w:ascii="Cambria" w:hAnsi="Cambria" w:eastAsia="ＭＳ 明朝" w:cs="Cambria" w:eastAsiaTheme="minorEastAsia"/>
                 <w:kern w:val="0"/>
                 <w:sz w:val="22"/>
                 <w:szCs w:val="22"/>
-                <w:lang w:val="en-US" w:eastAsia="en-US" w:bidi="ar-SA"/>
               </w:rPr>
               <w:t>꽃받침 길이</w:t>
             </w:r>
             <w:r>
               <w:rPr>
-                <w:rFonts w:eastAsia="ＭＳ 明朝" w:cs=""/>
+                <w:rFonts w:ascii="Cambria" w:hAnsi="Cambria" w:eastAsia="ＭＳ 明朝" w:cs="Cambria" w:asciiTheme="minorHAnsi" w:hAnsiTheme="minorHAnsi"/>
                 <w:kern w:val="0"/>
                 <w:sz w:val="22"/>
                 <w:szCs w:val="22"/>
-                <w:lang w:val="en-US" w:eastAsia="en-US" w:bidi="ar-SA"/>
               </w:rPr>
               <w:t xml:space="preserve">, </w:t>
             </w:r>
             <w:r>
               <w:rPr>
-                <w:rFonts w:ascii="Cambria" w:hAnsi="Cambria" w:cs=""/>
+                <w:rFonts w:ascii="Cambria" w:hAnsi="Cambria" w:eastAsia="ＭＳ 明朝" w:cs="Cambria" w:eastAsiaTheme="minorEastAsia"/>
                 <w:kern w:val="0"/>
                 <w:sz w:val="22"/>
                 <w:szCs w:val="22"/>
-                <w:lang w:val="en-US" w:eastAsia="en-US" w:bidi="ar-SA"/>
               </w:rPr>
               <w:t>꽃받침 너비</w:t>
             </w:r>
@@ -1106,40 +1303,48 @@
         <w:tc>
           <w:tcPr>
             <w:tcW w:w="2880" w:type="dxa"/>
-            <w:tcBorders/>
-            <w:shd w:color="auto" w:fill="FFFFFF" w:val="clear"/>
+            <w:tcBorders>
+              <w:top w:val="single" w:sz="4" w:space="0" w:color="auto"/>
+              <w:left w:val="single" w:sz="4" w:space="0" w:color="auto"/>
+              <w:bottom w:val="single" w:sz="4" w:space="0" w:color="auto"/>
+              <w:right w:val="single" w:sz="4" w:space="0" w:color="auto"/>
+            </w:tcBorders>
+            <w:shd w:val="clear" w:fill="FFFFFF"/>
+            <w:tcMar>
+              <w:top w:w="0" w:type="dxa"/>
+              <w:left w:w="108" w:type="dxa"/>
+              <w:bottom w:w="0" w:type="dxa"/>
+              <w:right w:w="108" w:type="dxa"/>
+            </w:tcMar>
           </w:tcPr>
           <w:p>
             <w:pPr>
               <w:pStyle w:val="Normal"/>
               <w:widowControl/>
-              <w:spacing w:lineRule="auto" w:line="240" w:before="0" w:after="0"/>
+              <w:spacing w:before="0" w:after="0" w:line="240" w:lineRule="auto"/>
               <w:jc w:val="left"/>
               <w:rPr>
-                <w:rFonts w:ascii="Cambria" w:hAnsi="Cambria" w:eastAsia="ＭＳ 明朝" w:cs=""/>
+                <w:rFonts w:ascii="Cambria" w:hAnsi="Cambria" w:eastAsia="ＭＳ 明朝"/>
                 <w:kern w:val="0"/>
                 <w:sz w:val="22"/>
                 <w:szCs w:val="22"/>
-                <w:lang w:val="en-US" w:eastAsia="en-US" w:bidi="ar-SA"/>
               </w:rPr>
             </w:pPr>
             <w:r>
               <w:rPr>
-                <w:rFonts w:ascii="Cambria" w:hAnsi="Cambria" w:cs=""/>
+                <w:rFonts w:ascii="Cambria" w:hAnsi="Cambria" w:eastAsia="ＭＳ 明朝" w:cs="Cambria" w:eastAsiaTheme="minorEastAsia"/>
                 <w:kern w:val="0"/>
                 <w:sz w:val="22"/>
                 <w:szCs w:val="22"/>
-                <w:lang w:val="en-US" w:eastAsia="en-US" w:bidi="ar-SA"/>
               </w:rPr>
               <w:t xml:space="preserve">꽃의 바깥쪽에서 꽃잎을 받쳐주고 보호하는 잎 </w:t>
             </w:r>
             <w:r>
               <w:rPr>
-                <w:rFonts w:eastAsia="ＭＳ 明朝" w:cs=""/>
+                <w:rFonts w:ascii="Cambria" w:hAnsi="Cambria" w:eastAsia="ＭＳ 明朝" w:cs="Cambria" w:asciiTheme="minorHAnsi" w:hAnsiTheme="minorHAnsi"/>
                 <w:kern w:val="0"/>
                 <w:sz w:val="22"/>
                 <w:szCs w:val="22"/>
-                <w:lang w:val="en-US" w:eastAsia="en-US" w:bidi="ar-SA"/>
               </w:rPr>
               <w:t>(cm)</w:t>
             </w:r>
@@ -1147,34 +1352,42 @@
         </w:tc>
       </w:tr>
       <w:tr>
-        <w:trPr/>
         <w:tc>
           <w:tcPr>
             <w:tcW w:w="2880" w:type="dxa"/>
-            <w:tcBorders/>
-            <w:shd w:color="auto" w:fill="F1F8E9" w:val="clear"/>
+            <w:tcBorders>
+              <w:top w:val="single" w:sz="4" w:space="0" w:color="auto"/>
+              <w:left w:val="single" w:sz="4" w:space="0" w:color="auto"/>
+              <w:bottom w:val="single" w:sz="4" w:space="0" w:color="auto"/>
+              <w:right w:val="single" w:sz="4" w:space="0" w:color="auto"/>
+            </w:tcBorders>
+            <w:shd w:val="clear" w:fill="F1F8E9"/>
+            <w:tcMar>
+              <w:top w:w="0" w:type="dxa"/>
+              <w:left w:w="108" w:type="dxa"/>
+              <w:bottom w:w="0" w:type="dxa"/>
+              <w:right w:w="108" w:type="dxa"/>
+            </w:tcMar>
           </w:tcPr>
           <w:p>
             <w:pPr>
               <w:pStyle w:val="Normal"/>
               <w:widowControl/>
-              <w:spacing w:lineRule="auto" w:line="240" w:before="0" w:after="0"/>
+              <w:spacing w:before="0" w:after="0" w:line="240" w:lineRule="auto"/>
               <w:jc w:val="left"/>
               <w:rPr>
-                <w:rFonts w:ascii="Cambria" w:hAnsi="Cambria" w:eastAsia="ＭＳ 明朝" w:cs=""/>
+                <w:rFonts w:ascii="Cambria" w:hAnsi="Cambria" w:eastAsia="ＭＳ 明朝"/>
                 <w:kern w:val="0"/>
                 <w:sz w:val="22"/>
                 <w:szCs w:val="22"/>
-                <w:lang w:val="en-US" w:eastAsia="en-US" w:bidi="ar-SA"/>
               </w:rPr>
             </w:pPr>
             <w:r>
               <w:rPr>
-                <w:rFonts w:ascii="Cambria" w:hAnsi="Cambria" w:cs=""/>
+                <w:rFonts w:ascii="Cambria" w:hAnsi="Cambria" w:eastAsia="ＭＳ 明朝" w:cs="Cambria" w:eastAsiaTheme="minorEastAsia"/>
                 <w:kern w:val="0"/>
                 <w:sz w:val="22"/>
                 <w:szCs w:val="22"/>
-                <w:lang w:val="en-US" w:eastAsia="en-US" w:bidi="ar-SA"/>
               </w:rPr>
               <w:t>측정한 부위</w:t>
             </w:r>
@@ -1183,50 +1396,57 @@
         <w:tc>
           <w:tcPr>
             <w:tcW w:w="2880" w:type="dxa"/>
-            <w:tcBorders/>
-            <w:shd w:color="auto" w:fill="F1F8E9" w:val="clear"/>
+            <w:tcBorders>
+              <w:top w:val="single" w:sz="4" w:space="0" w:color="auto"/>
+              <w:left w:val="single" w:sz="4" w:space="0" w:color="auto"/>
+              <w:bottom w:val="single" w:sz="4" w:space="0" w:color="auto"/>
+              <w:right w:val="single" w:sz="4" w:space="0" w:color="auto"/>
+            </w:tcBorders>
+            <w:shd w:val="clear" w:fill="F1F8E9"/>
+            <w:tcMar>
+              <w:top w:w="0" w:type="dxa"/>
+              <w:left w:w="108" w:type="dxa"/>
+              <w:bottom w:w="0" w:type="dxa"/>
+              <w:right w:w="108" w:type="dxa"/>
+            </w:tcMar>
           </w:tcPr>
           <w:p>
             <w:pPr>
               <w:pStyle w:val="Normal"/>
               <w:widowControl/>
-              <w:spacing w:lineRule="auto" w:line="240" w:before="0" w:after="0"/>
+              <w:spacing w:before="0" w:after="0" w:line="240" w:lineRule="auto"/>
               <w:jc w:val="left"/>
               <w:rPr>
-                <w:rFonts w:ascii="Cambria" w:hAnsi="Cambria" w:eastAsia="ＭＳ 明朝" w:cs=""/>
+                <w:rFonts w:ascii="Cambria" w:hAnsi="Cambria" w:eastAsia="ＭＳ 明朝"/>
                 <w:kern w:val="0"/>
                 <w:sz w:val="22"/>
                 <w:szCs w:val="22"/>
-                <w:lang w:val="en-US" w:eastAsia="en-US" w:bidi="ar-SA"/>
               </w:rPr>
             </w:pPr>
             <w:r>
               <w:rPr>
-                <w:rFonts w:ascii="Cambria" w:hAnsi="Cambria" w:cs=""/>
+                <w:rFonts w:ascii="Cambria" w:hAnsi="Cambria" w:eastAsia="ＭＳ 明朝" w:cs="Cambria" w:eastAsiaTheme="minorEastAsia"/>
                 <w:kern w:val="0"/>
                 <w:sz w:val="22"/>
                 <w:szCs w:val="22"/>
-                <w:lang w:val="en-US" w:eastAsia="en-US" w:bidi="ar-SA"/>
               </w:rPr>
               <w:t>꽃잎 길이</w:t>
             </w:r>
             <w:r>
               <w:rPr>
-                <w:rFonts w:eastAsia="ＭＳ 明朝" w:cs=""/>
+                <w:rFonts w:ascii="Cambria" w:hAnsi="Cambria" w:eastAsia="ＭＳ 明朝" w:cs="Cambria" w:asciiTheme="minorHAnsi" w:hAnsiTheme="minorHAnsi"/>
                 <w:kern w:val="0"/>
                 <w:sz w:val="22"/>
                 <w:szCs w:val="22"/>
-                <w:lang w:val="en-US" w:eastAsia="en-US" w:bidi="ar-SA"/>
               </w:rPr>
               <w:t xml:space="preserve">, </w:t>
             </w:r>
             <w:r>
               <w:rPr>
-                <w:rFonts w:ascii="Cambria" w:hAnsi="Cambria" w:cs=""/>
+                <w:rFonts w:ascii="Cambria" w:hAnsi="Cambria" w:eastAsia="ＭＳ 明朝" w:cs="Cambria" w:eastAsiaTheme="minorEastAsia"/>
                 <w:kern w:val="0"/>
                 <w:sz w:val="22"/>
                 <w:szCs w:val="22"/>
-                <w:lang w:val="en-US" w:eastAsia="en-US" w:bidi="ar-SA"/>
               </w:rPr>
               <w:t>꽃잎 너비</w:t>
             </w:r>
@@ -1235,40 +1455,48 @@
         <w:tc>
           <w:tcPr>
             <w:tcW w:w="2880" w:type="dxa"/>
-            <w:tcBorders/>
-            <w:shd w:color="auto" w:fill="F1F8E9" w:val="clear"/>
+            <w:tcBorders>
+              <w:top w:val="single" w:sz="4" w:space="0" w:color="auto"/>
+              <w:left w:val="single" w:sz="4" w:space="0" w:color="auto"/>
+              <w:bottom w:val="single" w:sz="4" w:space="0" w:color="auto"/>
+              <w:right w:val="single" w:sz="4" w:space="0" w:color="auto"/>
+            </w:tcBorders>
+            <w:shd w:val="clear" w:fill="F1F8E9"/>
+            <w:tcMar>
+              <w:top w:w="0" w:type="dxa"/>
+              <w:left w:w="108" w:type="dxa"/>
+              <w:bottom w:w="0" w:type="dxa"/>
+              <w:right w:w="108" w:type="dxa"/>
+            </w:tcMar>
           </w:tcPr>
           <w:p>
             <w:pPr>
               <w:pStyle w:val="Normal"/>
               <w:widowControl/>
-              <w:spacing w:lineRule="auto" w:line="240" w:before="0" w:after="0"/>
+              <w:spacing w:before="0" w:after="0" w:line="240" w:lineRule="auto"/>
               <w:jc w:val="left"/>
               <w:rPr>
-                <w:rFonts w:ascii="Cambria" w:hAnsi="Cambria" w:eastAsia="ＭＳ 明朝" w:cs=""/>
+                <w:rFonts w:ascii="Cambria" w:hAnsi="Cambria" w:eastAsia="ＭＳ 明朝"/>
                 <w:kern w:val="0"/>
                 <w:sz w:val="22"/>
                 <w:szCs w:val="22"/>
-                <w:lang w:val="en-US" w:eastAsia="en-US" w:bidi="ar-SA"/>
               </w:rPr>
             </w:pPr>
             <w:r>
               <w:rPr>
-                <w:rFonts w:ascii="Cambria" w:hAnsi="Cambria" w:cs=""/>
+                <w:rFonts w:ascii="Cambria" w:hAnsi="Cambria" w:eastAsia="ＭＳ 明朝" w:cs="Cambria" w:eastAsiaTheme="minorEastAsia"/>
                 <w:kern w:val="0"/>
                 <w:sz w:val="22"/>
                 <w:szCs w:val="22"/>
-                <w:lang w:val="en-US" w:eastAsia="en-US" w:bidi="ar-SA"/>
               </w:rPr>
               <w:t xml:space="preserve">꽃의 안쪽에서 곤충을 유인하는 크고 화려한 잎 </w:t>
             </w:r>
             <w:r>
               <w:rPr>
-                <w:rFonts w:eastAsia="ＭＳ 明朝" w:cs=""/>
+                <w:rFonts w:ascii="Cambria" w:hAnsi="Cambria" w:eastAsia="ＭＳ 明朝" w:cs="Cambria" w:asciiTheme="minorHAnsi" w:hAnsiTheme="minorHAnsi"/>
                 <w:kern w:val="0"/>
                 <w:sz w:val="22"/>
                 <w:szCs w:val="22"/>
-                <w:lang w:val="en-US" w:eastAsia="en-US" w:bidi="ar-SA"/>
               </w:rPr>
               <w:t>(cm)</w:t>
             </w:r>
@@ -1282,40 +1510,65 @@
         <w:pBdr>
           <w:bottom w:val="single" w:sz="4" w:space="0" w:color="000000"/>
         </w:pBdr>
-        <w:rPr/>
+        <w:jc w:val="left"/>
       </w:pPr>
       <w:r>
         <w:rPr>
+          <w:rFonts w:ascii="Calibri" w:hAnsi="Calibri" w:eastAsia="ＭＳ ゴシック" w:cs="Calibri" w:asciiTheme="majorHAnsi" w:hAnsiTheme="majorHAnsi" w:eastAsiaTheme="majorEastAsia" w:csTheme="majorBidi"/>
           <w:b/>
+          <w:bCs/>
+          <w:color w:val="365F91" w:themeColor="accent1" w:themeShade="bf"/>
+          <w:kern w:val="0"/>
           <w:sz w:val="26"/>
+          <w:szCs w:val="28"/>
         </w:rPr>
         <w:t>3. AI</w:t>
       </w:r>
       <w:r>
         <w:rPr>
+          <w:rFonts w:ascii="Calibri" w:hAnsi="Calibri" w:eastAsia="ＭＳ ゴシック" w:cs="Calibri" w:asciiTheme="majorHAnsi" w:hAnsiTheme="majorHAnsi" w:eastAsiaTheme="majorEastAsia" w:csTheme="majorBidi"/>
           <w:b/>
+          <w:bCs/>
+          <w:color w:val="365F91" w:themeColor="accent1" w:themeShade="bf"/>
+          <w:kern w:val="0"/>
           <w:sz w:val="26"/>
+          <w:szCs w:val="28"/>
         </w:rPr>
         <w:t xml:space="preserve">와 함께한 탐구 방법 </w:t>
       </w:r>
       <w:r>
         <w:rPr>
+          <w:rFonts w:ascii="Calibri" w:hAnsi="Calibri" w:eastAsia="ＭＳ ゴシック" w:cs="Calibri" w:asciiTheme="majorHAnsi" w:hAnsiTheme="majorHAnsi" w:eastAsiaTheme="majorEastAsia" w:csTheme="majorBidi"/>
           <w:b/>
+          <w:bCs/>
+          <w:color w:val="365F91" w:themeColor="accent1" w:themeShade="bf"/>
+          <w:kern w:val="0"/>
           <w:sz w:val="26"/>
+          <w:szCs w:val="28"/>
         </w:rPr>
         <w:t>(</w:t>
       </w:r>
       <w:r>
         <w:rPr>
+          <w:rFonts w:ascii="Calibri" w:hAnsi="Calibri" w:eastAsia="ＭＳ ゴシック" w:cs="Calibri" w:asciiTheme="majorHAnsi" w:hAnsiTheme="majorHAnsi" w:eastAsiaTheme="majorEastAsia" w:csTheme="majorBidi"/>
           <w:b/>
+          <w:bCs/>
+          <w:color w:val="365F91" w:themeColor="accent1" w:themeShade="bf"/>
+          <w:kern w:val="0"/>
           <w:sz w:val="26"/>
+          <w:szCs w:val="28"/>
         </w:rPr>
         <w:t>머신러닝의 기본 원리</w:t>
       </w:r>
       <w:r>
         <w:rPr>
+          <w:rFonts w:ascii="Calibri" w:hAnsi="Calibri" w:eastAsia="ＭＳ ゴシック" w:cs="Calibri" w:asciiTheme="majorHAnsi" w:hAnsiTheme="majorHAnsi" w:eastAsiaTheme="majorEastAsia" w:csTheme="majorBidi"/>
           <w:b/>
+          <w:bCs/>
+          <w:color w:val="365F91" w:themeColor="accent1" w:themeShade="bf"/>
+          <w:kern w:val="0"/>
           <w:sz w:val="26"/>
+          <w:szCs w:val="28"/>
         </w:rPr>
         <w:t>)</w:t>
       </w:r>
@@ -1323,290 +1576,55 @@
     <w:p>
       <w:pPr>
         <w:pStyle w:val="Normal"/>
-        <w:rPr/>
+        <w:jc w:val="left"/>
       </w:pPr>
       <w:r>
         <w:rPr>
+          <w:rFonts w:ascii="Cambria" w:hAnsi="Cambria" w:eastAsia="ＭＳ 明朝" w:cs="Cambria" w:asciiTheme="minorHAnsi" w:hAnsiTheme="minorHAnsi" w:eastAsiaTheme="minorEastAsia" w:csTheme="minorBidi"/>
+          <w:kern w:val="0"/>
           <w:sz w:val="20"/>
+          <w:szCs w:val="22"/>
         </w:rPr>
-        <w:t>인공지능</w:t>
+        <w:t>인공지능(머신러닝)은 사람이 일일이 규칙을 알려주지 않아도, 많은 데이터를 보면서 스스로 규칙을 찾아내는 컴퓨터 학습 방식이다.</w:t>
+      </w:r>
+      <w:r>
+        <w:br w:type="textWrapping"/>
+      </w:r>
+      <w:r>
+        <w:br w:type="textWrapping"/>
       </w:r>
       <w:r>
         <w:rPr>
+          <w:rFonts w:ascii="Cambria" w:hAnsi="Cambria" w:eastAsia="ＭＳ 明朝" w:cs="Cambria" w:asciiTheme="minorHAnsi" w:hAnsiTheme="minorHAnsi" w:eastAsiaTheme="minorEastAsia" w:csTheme="minorBidi"/>
+          <w:kern w:val="0"/>
           <w:sz w:val="20"/>
+          <w:szCs w:val="22"/>
         </w:rPr>
-        <w:t>(</w:t>
+        <w:t>1) AI 공부시키기: 150송이 중 120송이의 '꽃받침·꽃잎 크기'와 '꽃 이름'을 AI에게 보여주며, 크기에 따라 꽃이 어떻게 다른지 스스로 기준을 세우도록 공부시켰다.</w:t>
+      </w:r>
+      <w:r>
+        <w:br w:type="textWrapping"/>
       </w:r>
       <w:r>
         <w:rPr>
+          <w:rFonts w:ascii="Cambria" w:hAnsi="Cambria" w:eastAsia="ＭＳ 明朝" w:cs="Cambria" w:asciiTheme="minorHAnsi" w:hAnsiTheme="minorHAnsi" w:eastAsiaTheme="minorEastAsia" w:csTheme="minorBidi"/>
+          <w:kern w:val="0"/>
           <w:sz w:val="20"/>
+          <w:szCs w:val="22"/>
         </w:rPr>
-        <w:t>머신러닝</w:t>
+        <w:t>2) AI 시험 보기: 공부를 마친 AI에게 한 번도 보지 못한 새로운 꽃 30송이의 크기만 보여주고, 꽃 이름을 맞혀보라고 시험을 치렀다.</w:t>
+      </w:r>
+      <w:r>
+        <w:br w:type="textWrapping"/>
       </w:r>
       <w:r>
         <w:rPr>
+          <w:rFonts w:ascii="Cambria" w:hAnsi="Cambria" w:eastAsia="ＭＳ 明朝" w:cs="Cambria" w:asciiTheme="minorHAnsi" w:hAnsiTheme="minorHAnsi" w:eastAsiaTheme="minorEastAsia" w:csTheme="minorBidi"/>
+          <w:kern w:val="0"/>
           <w:sz w:val="20"/>
+          <w:szCs w:val="22"/>
         </w:rPr>
-        <w:t>)</w:t>
-      </w:r>
-      <w:r>
-        <w:rPr>
-          <w:sz w:val="20"/>
-        </w:rPr>
-        <w:t>은 사람이 일일이 규칙을 알려주지 않아도</w:t>
-      </w:r>
-      <w:r>
-        <w:rPr>
-          <w:sz w:val="20"/>
-        </w:rPr>
-        <w:t xml:space="preserve">, </w:t>
-      </w:r>
-      <w:r>
-        <w:rPr>
-          <w:sz w:val="20"/>
-        </w:rPr>
-        <w:t>많은 데이터를 보면서 스스로 규칙을 찾아내는 컴퓨터 학습 방식이다</w:t>
-      </w:r>
-      <w:r>
-        <w:rPr>
-          <w:sz w:val="20"/>
-        </w:rPr>
-        <w:t>.</w:t>
-        <w:br/>
-        <w:br/>
-        <w:t xml:space="preserve">1) AI </w:t>
-      </w:r>
-      <w:r>
-        <w:rPr>
-          <w:sz w:val="20"/>
-        </w:rPr>
-        <w:t>공부시키기</w:t>
-      </w:r>
-      <w:r>
-        <w:rPr>
-          <w:sz w:val="20"/>
-        </w:rPr>
-        <w:t>: 150</w:t>
-      </w:r>
-      <w:r>
-        <w:rPr>
-          <w:sz w:val="20"/>
-        </w:rPr>
-        <w:t xml:space="preserve">송이 중 </w:t>
-      </w:r>
-      <w:r>
-        <w:rPr>
-          <w:sz w:val="20"/>
-        </w:rPr>
-        <w:t>120</w:t>
-      </w:r>
-      <w:r>
-        <w:rPr>
-          <w:sz w:val="20"/>
-        </w:rPr>
-        <w:t xml:space="preserve">송이의 </w:t>
-      </w:r>
-      <w:r>
-        <w:rPr>
-          <w:sz w:val="20"/>
-        </w:rPr>
-        <w:t>'</w:t>
-      </w:r>
-      <w:r>
-        <w:rPr>
-          <w:sz w:val="20"/>
-        </w:rPr>
-        <w:t>꽃받침</w:t>
-      </w:r>
-      <w:r>
-        <w:rPr>
-          <w:sz w:val="20"/>
-        </w:rPr>
-        <w:t>·</w:t>
-      </w:r>
-      <w:r>
-        <w:rPr>
-          <w:sz w:val="20"/>
-        </w:rPr>
-        <w:t>꽃잎 크기</w:t>
-      </w:r>
-      <w:r>
-        <w:rPr>
-          <w:sz w:val="20"/>
-        </w:rPr>
-        <w:t>'</w:t>
-      </w:r>
-      <w:r>
-        <w:rPr>
-          <w:sz w:val="20"/>
-        </w:rPr>
-        <w:t xml:space="preserve">와 </w:t>
-      </w:r>
-      <w:r>
-        <w:rPr>
-          <w:sz w:val="20"/>
-        </w:rPr>
-        <w:t>'</w:t>
-      </w:r>
-      <w:r>
-        <w:rPr>
-          <w:sz w:val="20"/>
-        </w:rPr>
-        <w:t>꽃 이름</w:t>
-      </w:r>
-      <w:r>
-        <w:rPr>
-          <w:sz w:val="20"/>
-        </w:rPr>
-        <w:t>'</w:t>
-      </w:r>
-      <w:r>
-        <w:rPr>
-          <w:sz w:val="20"/>
-        </w:rPr>
-        <w:t xml:space="preserve">을 </w:t>
-      </w:r>
-      <w:r>
-        <w:rPr>
-          <w:sz w:val="20"/>
-        </w:rPr>
-        <w:t>AI</w:t>
-      </w:r>
-      <w:r>
-        <w:rPr>
-          <w:sz w:val="20"/>
-        </w:rPr>
-        <w:t>에게 보여주며</w:t>
-      </w:r>
-      <w:r>
-        <w:rPr>
-          <w:sz w:val="20"/>
-        </w:rPr>
-        <w:t xml:space="preserve">, </w:t>
-      </w:r>
-      <w:r>
-        <w:rPr>
-          <w:sz w:val="20"/>
-        </w:rPr>
-        <w:t>크기에 따라 꽃이 어떻게 다른지 스스로 기준을 세우도록 공부시켰다</w:t>
-      </w:r>
-      <w:r>
-        <w:rPr>
-          <w:sz w:val="20"/>
-        </w:rPr>
-        <w:t>.</w:t>
-        <w:br/>
-        <w:t xml:space="preserve">2) AI </w:t>
-      </w:r>
-      <w:r>
-        <w:rPr>
-          <w:sz w:val="20"/>
-        </w:rPr>
-        <w:t>시험 보기</w:t>
-      </w:r>
-      <w:r>
-        <w:rPr>
-          <w:sz w:val="20"/>
-        </w:rPr>
-        <w:t xml:space="preserve">: </w:t>
-      </w:r>
-      <w:r>
-        <w:rPr>
-          <w:sz w:val="20"/>
-        </w:rPr>
-        <w:t xml:space="preserve">공부를 마친 </w:t>
-      </w:r>
-      <w:r>
-        <w:rPr>
-          <w:sz w:val="20"/>
-        </w:rPr>
-        <w:t>AI</w:t>
-      </w:r>
-      <w:r>
-        <w:rPr>
-          <w:sz w:val="20"/>
-        </w:rPr>
-        <w:t xml:space="preserve">에게 한 번도 보지 못한 새로운 꽃 </w:t>
-      </w:r>
-      <w:r>
-        <w:rPr>
-          <w:sz w:val="20"/>
-        </w:rPr>
-        <w:t>30</w:t>
-      </w:r>
-      <w:r>
-        <w:rPr>
-          <w:sz w:val="20"/>
-        </w:rPr>
-        <w:t>송이의 크기만 보여주고</w:t>
-      </w:r>
-      <w:r>
-        <w:rPr>
-          <w:sz w:val="20"/>
-        </w:rPr>
-        <w:t xml:space="preserve">, </w:t>
-      </w:r>
-      <w:r>
-        <w:rPr>
-          <w:sz w:val="20"/>
-        </w:rPr>
-        <w:t>꽃 이름을 맞혀보라고 시험을 치렀다</w:t>
-      </w:r>
-      <w:r>
-        <w:rPr>
-          <w:sz w:val="20"/>
-        </w:rPr>
-        <w:t>.</w:t>
-        <w:br/>
-        <w:t xml:space="preserve">3) </w:t>
-      </w:r>
-      <w:r>
-        <w:rPr>
-          <w:sz w:val="20"/>
-        </w:rPr>
-        <w:t>시험 결과</w:t>
-      </w:r>
-      <w:r>
-        <w:rPr>
-          <w:sz w:val="20"/>
-        </w:rPr>
-        <w:t>: AI</w:t>
-      </w:r>
-      <w:r>
-        <w:rPr>
-          <w:sz w:val="20"/>
-        </w:rPr>
-        <w:t xml:space="preserve">는 </w:t>
-      </w:r>
-      <w:r>
-        <w:rPr>
-          <w:sz w:val="20"/>
-        </w:rPr>
-        <w:t>30</w:t>
-      </w:r>
-      <w:r>
-        <w:rPr>
-          <w:sz w:val="20"/>
-        </w:rPr>
-        <w:t xml:space="preserve">문제를 하나도 틀리지 않고 </w:t>
-      </w:r>
-      <w:r>
-        <w:rPr>
-          <w:sz w:val="20"/>
-        </w:rPr>
-        <w:t>100</w:t>
-      </w:r>
-      <w:r>
-        <w:rPr>
-          <w:sz w:val="20"/>
-        </w:rPr>
-        <w:t>점 만점으로 모든 꽃의 품종을 완벽하게 맞혔다</w:t>
-      </w:r>
-      <w:r>
-        <w:rPr>
-          <w:sz w:val="20"/>
-        </w:rPr>
-        <w:t>!</w:t>
+        <w:t>3) 시험 결과: AI는 30문제를 하나도 틀리지 않고 100점 만점으로 모든 꽃의 품종을 완벽하게 맞혔다!</w:t>
       </w:r>
     </w:p>
     <w:p>
@@ -1615,40 +1633,65 @@
         <w:pBdr>
           <w:bottom w:val="single" w:sz="4" w:space="0" w:color="000000"/>
         </w:pBdr>
-        <w:rPr/>
+        <w:jc w:val="left"/>
       </w:pPr>
       <w:r>
         <w:rPr>
+          <w:rFonts w:ascii="Calibri" w:hAnsi="Calibri" w:eastAsia="ＭＳ ゴシック" w:cs="Calibri" w:asciiTheme="majorHAnsi" w:hAnsiTheme="majorHAnsi" w:eastAsiaTheme="majorEastAsia" w:csTheme="majorBidi"/>
           <w:b/>
+          <w:bCs/>
+          <w:color w:val="365F91" w:themeColor="accent1" w:themeShade="bf"/>
+          <w:kern w:val="0"/>
           <w:sz w:val="26"/>
+          <w:szCs w:val="28"/>
         </w:rPr>
         <w:t>4. AI</w:t>
       </w:r>
       <w:r>
         <w:rPr>
+          <w:rFonts w:ascii="Calibri" w:hAnsi="Calibri" w:eastAsia="ＭＳ ゴシック" w:cs="Calibri" w:asciiTheme="majorHAnsi" w:hAnsiTheme="majorHAnsi" w:eastAsiaTheme="majorEastAsia" w:csTheme="majorBidi"/>
           <w:b/>
+          <w:bCs/>
+          <w:color w:val="365F91" w:themeColor="accent1" w:themeShade="bf"/>
+          <w:kern w:val="0"/>
           <w:sz w:val="26"/>
+          <w:szCs w:val="28"/>
         </w:rPr>
         <w:t xml:space="preserve">가 발견한 붓꽃의 생물학적 특징 </w:t>
       </w:r>
       <w:r>
         <w:rPr>
+          <w:rFonts w:ascii="Calibri" w:hAnsi="Calibri" w:eastAsia="ＭＳ ゴシック" w:cs="Calibri" w:asciiTheme="majorHAnsi" w:hAnsiTheme="majorHAnsi" w:eastAsiaTheme="majorEastAsia" w:csTheme="majorBidi"/>
           <w:b/>
+          <w:bCs/>
+          <w:color w:val="365F91" w:themeColor="accent1" w:themeShade="bf"/>
+          <w:kern w:val="0"/>
           <w:sz w:val="26"/>
+          <w:szCs w:val="28"/>
         </w:rPr>
         <w:t>(</w:t>
       </w:r>
       <w:r>
         <w:rPr>
+          <w:rFonts w:ascii="Calibri" w:hAnsi="Calibri" w:eastAsia="ＭＳ ゴシック" w:cs="Calibri" w:asciiTheme="majorHAnsi" w:hAnsiTheme="majorHAnsi" w:eastAsiaTheme="majorEastAsia" w:csTheme="majorBidi"/>
           <w:b/>
+          <w:bCs/>
+          <w:color w:val="365F91" w:themeColor="accent1" w:themeShade="bf"/>
+          <w:kern w:val="0"/>
           <w:sz w:val="26"/>
+          <w:szCs w:val="28"/>
         </w:rPr>
         <w:t>스무고개 규칙 분석</w:t>
       </w:r>
       <w:r>
         <w:rPr>
+          <w:rFonts w:ascii="Calibri" w:hAnsi="Calibri" w:eastAsia="ＭＳ ゴシック" w:cs="Calibri" w:asciiTheme="majorHAnsi" w:hAnsiTheme="majorHAnsi" w:eastAsiaTheme="majorEastAsia" w:csTheme="majorBidi"/>
           <w:b/>
+          <w:bCs/>
+          <w:color w:val="365F91" w:themeColor="accent1" w:themeShade="bf"/>
+          <w:kern w:val="0"/>
           <w:sz w:val="26"/>
+          <w:szCs w:val="28"/>
         </w:rPr>
         <w:t>)</w:t>
       </w:r>
@@ -1656,15 +1699,14 @@
     <w:p>
       <w:pPr>
         <w:pStyle w:val="Normal"/>
-        <w:rPr/>
+        <w:jc w:val="left"/>
       </w:pPr>
       <w:r>
-        <w:rPr/>
         <w:drawing>
           <wp:inline distT="0" distB="0" distL="0" distR="0">
-            <wp:extent cx="5029200" cy="3767455"/>
+            <wp:extent cx="5029200" cy="3771900"/>
             <wp:effectExtent l="0" t="0" r="0" b="0"/>
-            <wp:docPr id="1" name="Picture 1" descr=""/>
+            <wp:docPr id="100000" name="Picture 100000"/>
             <wp:cNvGraphicFramePr>
               <a:graphicFrameLocks xmlns:a="http://schemas.openxmlformats.org/drawingml/2006/main" noChangeAspect="1"/>
             </wp:cNvGraphicFramePr>
@@ -1672,26 +1714,23 @@
               <a:graphicData uri="http://schemas.openxmlformats.org/drawingml/2006/picture">
                 <pic:pic xmlns:pic="http://schemas.openxmlformats.org/drawingml/2006/picture">
                   <pic:nvPicPr>
-                    <pic:cNvPr id="1" name="Picture 1" descr=""/>
-                    <pic:cNvPicPr>
-                      <a:picLocks noChangeAspect="1" noChangeArrowheads="1"/>
-                    </pic:cNvPicPr>
+                    <pic:cNvPr id="100000" name="image100000"/>
+                    <pic:cNvPicPr/>
                   </pic:nvPicPr>
                   <pic:blipFill>
-                    <a:blip r:embed="rId2"/>
+                    <a:blip r:embed="rId8"/>
                     <a:stretch>
                       <a:fillRect/>
                     </a:stretch>
                   </pic:blipFill>
-                  <pic:spPr bwMode="auto">
+                  <pic:spPr>
                     <a:xfrm>
                       <a:off x="0" y="0"/>
-                      <a:ext cx="5029200" cy="3767455"/>
+                      <a:ext cx="5029200" cy="3771900"/>
                     </a:xfrm>
                     <a:prstGeom prst="rect">
                       <a:avLst/>
                     </a:prstGeom>
-                    <a:noFill/>
                   </pic:spPr>
                 </pic:pic>
               </a:graphicData>
@@ -1703,109 +1742,161 @@
     <w:p>
       <w:pPr>
         <w:pStyle w:val="Normal"/>
-        <w:rPr/>
+        <w:jc w:val="left"/>
       </w:pPr>
       <w:r>
         <w:rPr>
+          <w:rFonts w:ascii="Cambria" w:hAnsi="Cambria" w:eastAsia="ＭＳ 明朝" w:cs="Cambria" w:asciiTheme="minorHAnsi" w:hAnsiTheme="minorHAnsi" w:eastAsiaTheme="minorEastAsia" w:csTheme="minorBidi"/>
           <w:i/>
+          <w:iCs/>
           <w:color w:val="666666"/>
+          <w:kern w:val="0"/>
           <w:sz w:val="18"/>
+          <w:szCs w:val="22"/>
         </w:rPr>
         <w:t>[</w:t>
       </w:r>
       <w:r>
         <w:rPr>
+          <w:rFonts w:ascii="Cambria" w:hAnsi="Cambria" w:eastAsia="ＭＳ 明朝" w:cs="Cambria" w:asciiTheme="minorHAnsi" w:hAnsiTheme="minorHAnsi" w:eastAsiaTheme="minorEastAsia" w:csTheme="minorBidi"/>
           <w:i/>
+          <w:iCs/>
           <w:color w:val="666666"/>
+          <w:kern w:val="0"/>
           <w:sz w:val="18"/>
+          <w:szCs w:val="22"/>
         </w:rPr>
         <w:t>그림</w:t>
       </w:r>
       <w:r>
         <w:rPr>
+          <w:rFonts w:ascii="Cambria" w:hAnsi="Cambria" w:eastAsia="ＭＳ 明朝" w:cs="Cambria" w:asciiTheme="minorHAnsi" w:hAnsiTheme="minorHAnsi" w:eastAsiaTheme="minorEastAsia" w:csTheme="minorBidi"/>
           <w:i/>
+          <w:iCs/>
           <w:color w:val="666666"/>
+          <w:kern w:val="0"/>
           <w:sz w:val="18"/>
+          <w:szCs w:val="22"/>
         </w:rPr>
         <w:t>] AI</w:t>
       </w:r>
       <w:r>
         <w:rPr>
+          <w:rFonts w:ascii="Cambria" w:hAnsi="Cambria" w:eastAsia="ＭＳ 明朝" w:cs="Cambria" w:asciiTheme="minorHAnsi" w:hAnsiTheme="minorHAnsi" w:eastAsiaTheme="minorEastAsia" w:csTheme="minorBidi"/>
           <w:i/>
+          <w:iCs/>
           <w:color w:val="666666"/>
+          <w:kern w:val="0"/>
           <w:sz w:val="18"/>
+          <w:szCs w:val="22"/>
         </w:rPr>
         <w:t xml:space="preserve">가 꽃의 종류를 맞히기 위해 만든 스무고개 판단 지도 </w:t>
       </w:r>
       <w:r>
         <w:rPr>
+          <w:rFonts w:ascii="Cambria" w:hAnsi="Cambria" w:eastAsia="ＭＳ 明朝" w:cs="Cambria" w:asciiTheme="minorHAnsi" w:hAnsiTheme="minorHAnsi" w:eastAsiaTheme="minorEastAsia" w:csTheme="minorBidi"/>
           <w:i/>
+          <w:iCs/>
           <w:color w:val="666666"/>
+          <w:kern w:val="0"/>
           <w:sz w:val="18"/>
+          <w:szCs w:val="22"/>
         </w:rPr>
         <w:t>(</w:t>
       </w:r>
       <w:r>
         <w:rPr>
+          <w:rFonts w:ascii="Cambria" w:hAnsi="Cambria" w:eastAsia="ＭＳ 明朝" w:cs="Cambria" w:asciiTheme="minorHAnsi" w:hAnsiTheme="minorHAnsi" w:eastAsiaTheme="minorEastAsia" w:csTheme="minorBidi"/>
           <w:i/>
+          <w:iCs/>
           <w:color w:val="666666"/>
+          <w:kern w:val="0"/>
           <w:sz w:val="18"/>
+          <w:szCs w:val="22"/>
         </w:rPr>
         <w:t>왼쪽</w:t>
       </w:r>
       <w:r>
         <w:rPr>
+          <w:rFonts w:ascii="Cambria" w:hAnsi="Cambria" w:eastAsia="ＭＳ 明朝" w:cs="Cambria" w:asciiTheme="minorHAnsi" w:hAnsiTheme="minorHAnsi" w:eastAsiaTheme="minorEastAsia" w:csTheme="minorBidi"/>
           <w:i/>
+          <w:iCs/>
           <w:color w:val="666666"/>
+          <w:kern w:val="0"/>
           <w:sz w:val="18"/>
+          <w:szCs w:val="22"/>
         </w:rPr>
         <w:t xml:space="preserve">: </w:t>
       </w:r>
       <w:r>
         <w:rPr>
+          <w:rFonts w:ascii="Cambria" w:hAnsi="Cambria" w:eastAsia="ＭＳ 明朝" w:cs="Cambria" w:asciiTheme="minorHAnsi" w:hAnsiTheme="minorHAnsi" w:eastAsiaTheme="minorEastAsia" w:csTheme="minorBidi"/>
           <w:i/>
+          <w:iCs/>
           <w:color w:val="666666"/>
+          <w:kern w:val="0"/>
           <w:sz w:val="18"/>
+          <w:szCs w:val="22"/>
         </w:rPr>
         <w:t>예</w:t>
       </w:r>
       <w:r>
         <w:rPr>
+          <w:rFonts w:ascii="Cambria" w:hAnsi="Cambria" w:eastAsia="ＭＳ 明朝" w:cs="Cambria" w:asciiTheme="minorHAnsi" w:hAnsiTheme="minorHAnsi" w:eastAsiaTheme="minorEastAsia" w:csTheme="minorBidi"/>
           <w:i/>
+          <w:iCs/>
           <w:color w:val="666666"/>
+          <w:kern w:val="0"/>
           <w:sz w:val="18"/>
+          <w:szCs w:val="22"/>
         </w:rPr>
         <w:t xml:space="preserve">, </w:t>
       </w:r>
       <w:r>
         <w:rPr>
+          <w:rFonts w:ascii="Cambria" w:hAnsi="Cambria" w:eastAsia="ＭＳ 明朝" w:cs="Cambria" w:asciiTheme="minorHAnsi" w:hAnsiTheme="minorHAnsi" w:eastAsiaTheme="minorEastAsia" w:csTheme="minorBidi"/>
           <w:i/>
+          <w:iCs/>
           <w:color w:val="666666"/>
+          <w:kern w:val="0"/>
           <w:sz w:val="18"/>
+          <w:szCs w:val="22"/>
         </w:rPr>
         <w:t>오른쪽</w:t>
       </w:r>
       <w:r>
         <w:rPr>
+          <w:rFonts w:ascii="Cambria" w:hAnsi="Cambria" w:eastAsia="ＭＳ 明朝" w:cs="Cambria" w:asciiTheme="minorHAnsi" w:hAnsiTheme="minorHAnsi" w:eastAsiaTheme="minorEastAsia" w:csTheme="minorBidi"/>
           <w:i/>
+          <w:iCs/>
           <w:color w:val="666666"/>
+          <w:kern w:val="0"/>
           <w:sz w:val="18"/>
+          <w:szCs w:val="22"/>
         </w:rPr>
         <w:t xml:space="preserve">: </w:t>
       </w:r>
       <w:r>
         <w:rPr>
+          <w:rFonts w:ascii="Cambria" w:hAnsi="Cambria" w:eastAsia="ＭＳ 明朝" w:cs="Cambria" w:asciiTheme="minorHAnsi" w:hAnsiTheme="minorHAnsi" w:eastAsiaTheme="minorEastAsia" w:csTheme="minorBidi"/>
           <w:i/>
+          <w:iCs/>
           <w:color w:val="666666"/>
+          <w:kern w:val="0"/>
           <w:sz w:val="18"/>
+          <w:szCs w:val="22"/>
         </w:rPr>
         <w:t>아니오</w:t>
       </w:r>
       <w:r>
         <w:rPr>
+          <w:rFonts w:ascii="Cambria" w:hAnsi="Cambria" w:eastAsia="ＭＳ 明朝" w:cs="Cambria" w:asciiTheme="minorHAnsi" w:hAnsiTheme="minorHAnsi" w:eastAsiaTheme="minorEastAsia" w:csTheme="minorBidi"/>
           <w:i/>
+          <w:iCs/>
           <w:color w:val="666666"/>
+          <w:kern w:val="0"/>
           <w:sz w:val="18"/>
+          <w:szCs w:val="22"/>
         </w:rPr>
         <w:t>)</w:t>
       </w:r>
@@ -1813,476 +1904,97 @@
     <w:p>
       <w:pPr>
         <w:pStyle w:val="Normal"/>
-        <w:rPr/>
+        <w:jc w:val="left"/>
       </w:pPr>
       <w:r>
         <w:rPr>
+          <w:rFonts w:ascii="Cambria" w:hAnsi="Cambria" w:eastAsia="ＭＳ 明朝" w:cs="Cambria" w:asciiTheme="minorHAnsi" w:hAnsiTheme="minorHAnsi" w:eastAsiaTheme="minorEastAsia" w:csTheme="minorBidi"/>
+          <w:kern w:val="0"/>
           <w:sz w:val="20"/>
+          <w:szCs w:val="22"/>
         </w:rPr>
-        <w:t>인공지능이 스스로 완성한 스무고개 지도를 분석해본 결과</w:t>
+        <w:t>인공지능이 스스로 완성한 스무고개 지도를 분석해본 결과, 붓꽃의 3가지 중요한 생물학적 특징을 발견할 수 있었다.</w:t>
+      </w:r>
+      <w:r>
+        <w:br w:type="textWrapping"/>
+      </w:r>
+      <w:r>
+        <w:br w:type="textWrapping"/>
       </w:r>
       <w:r>
         <w:rPr>
+          <w:rFonts w:ascii="Cambria" w:hAnsi="Cambria" w:eastAsia="ＭＳ 明朝" w:cs="Cambria" w:asciiTheme="minorHAnsi" w:hAnsiTheme="minorHAnsi" w:eastAsiaTheme="minorEastAsia" w:csTheme="minorBidi"/>
+          <w:kern w:val="0"/>
           <w:sz w:val="20"/>
+          <w:szCs w:val="22"/>
         </w:rPr>
-        <w:t xml:space="preserve">, </w:t>
+        <w:t>■ 발견 1: 꽃받침보다 '꽃잎 크기'가 품종 구별의 핵심이다!</w:t>
+      </w:r>
+      <w:r>
+        <w:br w:type="textWrapping"/>
       </w:r>
       <w:r>
         <w:rPr>
+          <w:rFonts w:ascii="Cambria" w:hAnsi="Cambria" w:eastAsia="ＭＳ 明朝" w:cs="Cambria" w:asciiTheme="minorHAnsi" w:hAnsiTheme="minorHAnsi" w:eastAsiaTheme="minorEastAsia" w:csTheme="minorBidi"/>
+          <w:kern w:val="0"/>
           <w:sz w:val="20"/>
+          <w:szCs w:val="22"/>
         </w:rPr>
-        <w:t xml:space="preserve">붓꽃의 </w:t>
+        <w:t>꽃받침은 3가지 붓꽃 모두 크기가 서로 비슷비슷해서 구별하기 어려웠다. 반면, 꽃잎은 품종마다 크기 차이가 매우 뚜렷했다. AI도 이를 스스로 알아채고 첫 번째 질문부터 꽃받침이 아닌 '꽃잎 크기'를 가장 먼저 물어보았다.</w:t>
+      </w:r>
+      <w:r>
+        <w:br w:type="textWrapping"/>
+      </w:r>
+      <w:r>
+        <w:br w:type="textWrapping"/>
       </w:r>
       <w:r>
         <w:rPr>
+          <w:rFonts w:ascii="Cambria" w:hAnsi="Cambria" w:eastAsia="ＭＳ 明朝" w:cs="Cambria" w:asciiTheme="minorHAnsi" w:hAnsiTheme="minorHAnsi" w:eastAsiaTheme="minorEastAsia" w:csTheme="minorBidi"/>
+          <w:kern w:val="0"/>
           <w:sz w:val="20"/>
+          <w:szCs w:val="22"/>
         </w:rPr>
-        <w:t>3</w:t>
+        <w:t>■ 발견 2: 꽃잎 길이 2.45 cm 이하이면 무조건 '세토사'!</w:t>
+      </w:r>
+      <w:r>
+        <w:br w:type="textWrapping"/>
       </w:r>
       <w:r>
         <w:rPr>
+          <w:rFonts w:ascii="Cambria" w:hAnsi="Cambria" w:eastAsia="ＭＳ 明朝" w:cs="Cambria" w:asciiTheme="minorHAnsi" w:hAnsiTheme="minorHAnsi" w:eastAsiaTheme="minorEastAsia" w:csTheme="minorBidi"/>
+          <w:kern w:val="0"/>
           <w:sz w:val="20"/>
+          <w:szCs w:val="22"/>
         </w:rPr>
-        <w:t>가지 중요한 생물학적 특징을 발견할 수 있었다</w:t>
+        <w:t>"꽃잎 길이가 2.45 cm 이하인가요?"라는 첫 번째 질문에 "예"라고 답한 꽃 40송이는 단 한 번에 모두 '세토사'로 분류되었다. 세토사는 3가지 붓꽃 중 꽃잎이 유난히 작고 짧아서 다른 꽃들과 확연히 구분된다.</w:t>
+      </w:r>
+      <w:r>
+        <w:br w:type="textWrapping"/>
+      </w:r>
+      <w:r>
+        <w:br w:type="textWrapping"/>
       </w:r>
       <w:r>
         <w:rPr>
+          <w:rFonts w:ascii="Cambria" w:hAnsi="Cambria" w:eastAsia="ＭＳ 明朝" w:cs="Cambria" w:asciiTheme="minorHAnsi" w:hAnsiTheme="minorHAnsi" w:eastAsiaTheme="minorEastAsia" w:csTheme="minorBidi"/>
+          <w:kern w:val="0"/>
           <w:sz w:val="20"/>
+          <w:szCs w:val="22"/>
         </w:rPr>
-        <w:t>.</w:t>
-        <w:br/>
-        <w:br/>
-        <w:t xml:space="preserve">■ </w:t>
+        <w:t>■ 발견 3: 버시칼라와 버지니카는 꽃잎 길이와 너비로 단계별 구분!</w:t>
+      </w:r>
+      <w:r>
+        <w:br w:type="textWrapping"/>
       </w:r>
       <w:r>
         <w:rPr>
+          <w:rFonts w:ascii="Cambria" w:hAnsi="Cambria" w:eastAsia="ＭＳ 明朝" w:cs="Cambria" w:asciiTheme="minorHAnsi" w:hAnsiTheme="minorHAnsi" w:eastAsiaTheme="minorEastAsia" w:csTheme="minorBidi"/>
+          <w:kern w:val="0"/>
           <w:sz w:val="20"/>
+          <w:szCs w:val="22"/>
         </w:rPr>
-        <w:t xml:space="preserve">발견 </w:t>
-      </w:r>
-      <w:r>
-        <w:rPr>
-          <w:sz w:val="20"/>
-        </w:rPr>
-        <w:t xml:space="preserve">1: </w:t>
-      </w:r>
-      <w:r>
-        <w:rPr>
-          <w:sz w:val="20"/>
-        </w:rPr>
-        <w:t xml:space="preserve">꽃받침보다 </w:t>
-      </w:r>
-      <w:r>
-        <w:rPr>
-          <w:sz w:val="20"/>
-        </w:rPr>
-        <w:t>'</w:t>
-      </w:r>
-      <w:r>
-        <w:rPr>
-          <w:sz w:val="20"/>
-        </w:rPr>
-        <w:t>꽃잎 크기</w:t>
-      </w:r>
-      <w:r>
-        <w:rPr>
-          <w:sz w:val="20"/>
-        </w:rPr>
-        <w:t>'</w:t>
-      </w:r>
-      <w:r>
-        <w:rPr>
-          <w:sz w:val="20"/>
-        </w:rPr>
-        <w:t>가 품종 구별의 핵심이다</w:t>
-      </w:r>
-      <w:r>
-        <w:rPr>
-          <w:sz w:val="20"/>
-        </w:rPr>
-        <w:t>!</w:t>
-        <w:br/>
-      </w:r>
-      <w:r>
-        <w:rPr>
-          <w:sz w:val="20"/>
-        </w:rPr>
-        <w:t xml:space="preserve">꽃받침은 </w:t>
-      </w:r>
-      <w:r>
-        <w:rPr>
-          <w:sz w:val="20"/>
-        </w:rPr>
-        <w:t>3</w:t>
-      </w:r>
-      <w:r>
-        <w:rPr>
-          <w:sz w:val="20"/>
-        </w:rPr>
-        <w:t>가지 붓꽃 모두 크기가 서로 비슷비슷해서 구별하기 어려웠다</w:t>
-      </w:r>
-      <w:r>
-        <w:rPr>
-          <w:sz w:val="20"/>
-        </w:rPr>
-        <w:t xml:space="preserve">. </w:t>
-      </w:r>
-      <w:r>
-        <w:rPr>
-          <w:sz w:val="20"/>
-        </w:rPr>
-        <w:t>반면</w:t>
-      </w:r>
-      <w:r>
-        <w:rPr>
-          <w:sz w:val="20"/>
-        </w:rPr>
-        <w:t xml:space="preserve">, </w:t>
-      </w:r>
-      <w:r>
-        <w:rPr>
-          <w:sz w:val="20"/>
-        </w:rPr>
-        <w:t>꽃잎은 품종마다 크기 차이가 매우 뚜렷했다</w:t>
-      </w:r>
-      <w:r>
-        <w:rPr>
-          <w:sz w:val="20"/>
-        </w:rPr>
-        <w:t>. AI</w:t>
-      </w:r>
-      <w:r>
-        <w:rPr>
-          <w:sz w:val="20"/>
-        </w:rPr>
-        <w:t xml:space="preserve">도 이를 스스로 알아채고 첫 번째 질문부터 꽃받침이 아닌 </w:t>
-      </w:r>
-      <w:r>
-        <w:rPr>
-          <w:sz w:val="20"/>
-        </w:rPr>
-        <w:t>'</w:t>
-      </w:r>
-      <w:r>
-        <w:rPr>
-          <w:sz w:val="20"/>
-        </w:rPr>
-        <w:t>꽃잎 크기</w:t>
-      </w:r>
-      <w:r>
-        <w:rPr>
-          <w:sz w:val="20"/>
-        </w:rPr>
-        <w:t>'</w:t>
-      </w:r>
-      <w:r>
-        <w:rPr>
-          <w:sz w:val="20"/>
-        </w:rPr>
-        <w:t>를 가장 먼저 물어보았다</w:t>
-      </w:r>
-      <w:r>
-        <w:rPr>
-          <w:sz w:val="20"/>
-        </w:rPr>
-        <w:t>.</w:t>
-        <w:br/>
-        <w:br/>
-        <w:t xml:space="preserve">■ </w:t>
-      </w:r>
-      <w:r>
-        <w:rPr>
-          <w:sz w:val="20"/>
-        </w:rPr>
-        <w:t xml:space="preserve">발견 </w:t>
-      </w:r>
-      <w:r>
-        <w:rPr>
-          <w:sz w:val="20"/>
-        </w:rPr>
-        <w:t xml:space="preserve">2: </w:t>
-      </w:r>
-      <w:r>
-        <w:rPr>
-          <w:sz w:val="20"/>
-        </w:rPr>
-        <w:t xml:space="preserve">꽃잎 길이 </w:t>
-      </w:r>
-      <w:r>
-        <w:rPr>
-          <w:sz w:val="20"/>
-        </w:rPr>
-        <w:t xml:space="preserve">2.45 cm </w:t>
-      </w:r>
-      <w:r>
-        <w:rPr>
-          <w:sz w:val="20"/>
-        </w:rPr>
-        <w:t xml:space="preserve">이하이면 무조건 </w:t>
-      </w:r>
-      <w:r>
-        <w:rPr>
-          <w:sz w:val="20"/>
-        </w:rPr>
-        <w:t>'</w:t>
-      </w:r>
-      <w:r>
-        <w:rPr>
-          <w:sz w:val="20"/>
-        </w:rPr>
-        <w:t>세토사</w:t>
-      </w:r>
-      <w:r>
-        <w:rPr>
-          <w:sz w:val="20"/>
-        </w:rPr>
-        <w:t>'!</w:t>
-        <w:br/>
-        <w:t>"</w:t>
-      </w:r>
-      <w:r>
-        <w:rPr>
-          <w:sz w:val="20"/>
-        </w:rPr>
-        <w:t xml:space="preserve">꽃잎 길이가 </w:t>
-      </w:r>
-      <w:r>
-        <w:rPr>
-          <w:sz w:val="20"/>
-        </w:rPr>
-        <w:t xml:space="preserve">2.45 cm </w:t>
-      </w:r>
-      <w:r>
-        <w:rPr>
-          <w:sz w:val="20"/>
-        </w:rPr>
-        <w:t>이하인가요</w:t>
-      </w:r>
-      <w:r>
-        <w:rPr>
-          <w:sz w:val="20"/>
-        </w:rPr>
-        <w:t>?"</w:t>
-      </w:r>
-      <w:r>
-        <w:rPr>
-          <w:sz w:val="20"/>
-        </w:rPr>
-        <w:t xml:space="preserve">라는 첫 번째 질문에 </w:t>
-      </w:r>
-      <w:r>
-        <w:rPr>
-          <w:sz w:val="20"/>
-        </w:rPr>
-        <w:t>"</w:t>
-      </w:r>
-      <w:r>
-        <w:rPr>
-          <w:sz w:val="20"/>
-        </w:rPr>
-        <w:t>예</w:t>
-      </w:r>
-      <w:r>
-        <w:rPr>
-          <w:sz w:val="20"/>
-        </w:rPr>
-        <w:t>"</w:t>
-      </w:r>
-      <w:r>
-        <w:rPr>
-          <w:sz w:val="20"/>
-        </w:rPr>
-        <w:t xml:space="preserve">라고 답한 꽃 </w:t>
-      </w:r>
-      <w:r>
-        <w:rPr>
-          <w:sz w:val="20"/>
-        </w:rPr>
-        <w:t>40</w:t>
-      </w:r>
-      <w:r>
-        <w:rPr>
-          <w:sz w:val="20"/>
-        </w:rPr>
-        <w:t xml:space="preserve">송이는 단 한 번에 모두 </w:t>
-      </w:r>
-      <w:r>
-        <w:rPr>
-          <w:sz w:val="20"/>
-        </w:rPr>
-        <w:t>'</w:t>
-      </w:r>
-      <w:r>
-        <w:rPr>
-          <w:sz w:val="20"/>
-        </w:rPr>
-        <w:t>세토사</w:t>
-      </w:r>
-      <w:r>
-        <w:rPr>
-          <w:sz w:val="20"/>
-        </w:rPr>
-        <w:t>'</w:t>
-      </w:r>
-      <w:r>
-        <w:rPr>
-          <w:sz w:val="20"/>
-        </w:rPr>
-        <w:t>로 분류되었다</w:t>
-      </w:r>
-      <w:r>
-        <w:rPr>
-          <w:sz w:val="20"/>
-        </w:rPr>
-        <w:t xml:space="preserve">. </w:t>
-      </w:r>
-      <w:r>
-        <w:rPr>
-          <w:sz w:val="20"/>
-        </w:rPr>
-        <w:t xml:space="preserve">세토사는 </w:t>
-      </w:r>
-      <w:r>
-        <w:rPr>
-          <w:sz w:val="20"/>
-        </w:rPr>
-        <w:t>3</w:t>
-      </w:r>
-      <w:r>
-        <w:rPr>
-          <w:sz w:val="20"/>
-        </w:rPr>
-        <w:t>가지 붓꽃 중 꽃잎이 유난히 작고 짧아서 다른 꽃들과 확연히 구분된다</w:t>
-      </w:r>
-      <w:r>
-        <w:rPr>
-          <w:sz w:val="20"/>
-        </w:rPr>
-        <w:t>.</w:t>
-        <w:br/>
-        <w:br/>
-        <w:t xml:space="preserve">■ </w:t>
-      </w:r>
-      <w:r>
-        <w:rPr>
-          <w:sz w:val="20"/>
-        </w:rPr>
-        <w:t xml:space="preserve">발견 </w:t>
-      </w:r>
-      <w:r>
-        <w:rPr>
-          <w:sz w:val="20"/>
-        </w:rPr>
-        <w:t xml:space="preserve">3: </w:t>
-      </w:r>
-      <w:r>
-        <w:rPr>
-          <w:sz w:val="20"/>
-        </w:rPr>
-        <w:t>버시칼라와 버지니카는 꽃잎 길이와 너비로 단계별 구분</w:t>
-      </w:r>
-      <w:r>
-        <w:rPr>
-          <w:sz w:val="20"/>
-        </w:rPr>
-        <w:t>!</w:t>
-        <w:br/>
-      </w:r>
-      <w:r>
-        <w:rPr>
-          <w:sz w:val="20"/>
-        </w:rPr>
-        <w:t xml:space="preserve">꽃잎 길이가 </w:t>
-      </w:r>
-      <w:r>
-        <w:rPr>
-          <w:sz w:val="20"/>
-        </w:rPr>
-        <w:t>2.45 cm</w:t>
-      </w:r>
-      <w:r>
-        <w:rPr>
-          <w:sz w:val="20"/>
-        </w:rPr>
-        <w:t>보다 큰 나머지 꽃들은 꽃잎 너비와 길이를 단계별로 한 번 더 비교했다</w:t>
-      </w:r>
-      <w:r>
-        <w:rPr>
-          <w:sz w:val="20"/>
-        </w:rPr>
-        <w:t xml:space="preserve">. </w:t>
-      </w:r>
-      <w:r>
-        <w:rPr>
-          <w:sz w:val="20"/>
-        </w:rPr>
-        <w:t xml:space="preserve">꽃잎 너비가 약 </w:t>
-      </w:r>
-      <w:r>
-        <w:rPr>
-          <w:sz w:val="20"/>
-        </w:rPr>
-        <w:t xml:space="preserve">1.65~1.75 cm </w:t>
-      </w:r>
-      <w:r>
-        <w:rPr>
-          <w:sz w:val="20"/>
-        </w:rPr>
-        <w:t xml:space="preserve">이하로 중간 크기이면 </w:t>
-      </w:r>
-      <w:r>
-        <w:rPr>
-          <w:sz w:val="20"/>
-        </w:rPr>
-        <w:t>'</w:t>
-      </w:r>
-      <w:r>
-        <w:rPr>
-          <w:sz w:val="20"/>
-        </w:rPr>
-        <w:t>버시칼라</w:t>
-      </w:r>
-      <w:r>
-        <w:rPr>
-          <w:sz w:val="20"/>
-        </w:rPr>
-        <w:t xml:space="preserve">', </w:t>
-      </w:r>
-      <w:r>
-        <w:rPr>
-          <w:sz w:val="20"/>
-        </w:rPr>
-        <w:t xml:space="preserve">그보다 더 크고 넓으면 대형 품종인 </w:t>
-      </w:r>
-      <w:r>
-        <w:rPr>
-          <w:sz w:val="20"/>
-        </w:rPr>
-        <w:t>'</w:t>
-      </w:r>
-      <w:r>
-        <w:rPr>
-          <w:sz w:val="20"/>
-        </w:rPr>
-        <w:t>버지니카</w:t>
-      </w:r>
-      <w:r>
-        <w:rPr>
-          <w:sz w:val="20"/>
-        </w:rPr>
-        <w:t>'</w:t>
-      </w:r>
-      <w:r>
-        <w:rPr>
-          <w:sz w:val="20"/>
-        </w:rPr>
-        <w:t>로 나뉘었다</w:t>
-      </w:r>
-      <w:r>
-        <w:rPr>
-          <w:sz w:val="20"/>
-        </w:rPr>
-        <w:t>.</w:t>
+        <w:t>꽃잎 길이가 2.45 cm보다 큰 나머지 꽃들은 꽃잎 너비와 길이를 단계별로 한 번 더 비교했다. 꽃잎 너비가 약 1.65~1.75 cm 이하로 중간 크기이면 '버시칼라', 그보다 더 크고 넓으면 대형 품종인 '버지니카'로 나뉘었다.</w:t>
       </w:r>
     </w:p>
     <w:p>
@@ -2291,19 +2003,29 @@
         <w:pBdr>
           <w:bottom w:val="single" w:sz="4" w:space="0" w:color="000000"/>
         </w:pBdr>
-        <w:rPr/>
+        <w:jc w:val="left"/>
       </w:pPr>
       <w:r>
         <w:rPr>
+          <w:rFonts w:ascii="Calibri" w:hAnsi="Calibri" w:eastAsia="ＭＳ ゴシック" w:cs="Calibri" w:asciiTheme="majorHAnsi" w:hAnsiTheme="majorHAnsi" w:eastAsiaTheme="majorEastAsia" w:csTheme="majorBidi"/>
           <w:b/>
+          <w:bCs/>
+          <w:color w:val="365F91" w:themeColor="accent1" w:themeShade="bf"/>
+          <w:kern w:val="0"/>
           <w:sz w:val="26"/>
+          <w:szCs w:val="28"/>
         </w:rPr>
         <w:t xml:space="preserve">5. </w:t>
       </w:r>
       <w:r>
         <w:rPr>
+          <w:rFonts w:ascii="Calibri" w:hAnsi="Calibri" w:eastAsia="ＭＳ ゴシック" w:cs="Calibri" w:asciiTheme="majorHAnsi" w:hAnsiTheme="majorHAnsi" w:eastAsiaTheme="majorEastAsia" w:csTheme="majorBidi"/>
           <w:b/>
+          <w:bCs/>
+          <w:color w:val="365F91" w:themeColor="accent1" w:themeShade="bf"/>
+          <w:kern w:val="0"/>
           <w:sz w:val="26"/>
+          <w:szCs w:val="28"/>
         </w:rPr>
         <w:t>탐구 결론 및 알게 된 점</w:t>
       </w:r>
@@ -2312,214 +2034,89 @@
       <w:pPr>
         <w:pStyle w:val="Normal"/>
         <w:widowControl/>
-        <w:bidi w:val="0"/>
-        <w:spacing w:lineRule="auto" w:line="276" w:before="0" w:after="200"/>
+        <w:spacing w:before="0" w:after="200" w:line="276" w:lineRule="auto"/>
         <w:jc w:val="left"/>
-        <w:rPr/>
       </w:pPr>
       <w:r>
         <w:rPr>
+          <w:rFonts w:ascii="Cambria" w:hAnsi="Cambria" w:eastAsia="ＭＳ 明朝" w:cs="Cambria" w:asciiTheme="minorHAnsi" w:hAnsiTheme="minorHAnsi" w:eastAsiaTheme="minorEastAsia" w:csTheme="minorBidi"/>
+          <w:kern w:val="0"/>
           <w:sz w:val="20"/>
+          <w:szCs w:val="22"/>
         </w:rPr>
-        <w:t xml:space="preserve">1) </w:t>
+        <w:t>1) 식물을 관찰할 때의 교훈:</w:t>
+      </w:r>
+      <w:r>
+        <w:br w:type="textWrapping"/>
       </w:r>
       <w:r>
         <w:rPr>
+          <w:rFonts w:ascii="Cambria" w:hAnsi="Cambria" w:eastAsia="ＭＳ 明朝" w:cs="Cambria" w:asciiTheme="minorHAnsi" w:hAnsiTheme="minorHAnsi" w:eastAsiaTheme="minorEastAsia" w:csTheme="minorBidi"/>
+          <w:kern w:val="0"/>
           <w:sz w:val="20"/>
+          <w:szCs w:val="22"/>
         </w:rPr>
-        <w:t>식물을 관찰할 때의 교훈</w:t>
+        <w:t>식물을 분류하고 관찰할 때는 단순히 전체적인 겉모습만 보는 것보다, 꽃잎 크기처럼 품종마다 뚜렷한 차이를 보이는 핵심 신체 부위를 정확히 측정하는 것이 가장 중요하다는 사실을 깨달았다.</w:t>
+      </w:r>
+      <w:r>
+        <w:br w:type="textWrapping"/>
+      </w:r>
+      <w:r>
+        <w:br w:type="textWrapping"/>
       </w:r>
       <w:r>
         <w:rPr>
+          <w:rFonts w:ascii="Cambria" w:hAnsi="Cambria" w:eastAsia="ＭＳ 明朝" w:cs="Cambria" w:asciiTheme="minorHAnsi" w:hAnsiTheme="minorHAnsi" w:eastAsiaTheme="minorEastAsia" w:csTheme="minorBidi"/>
+          <w:kern w:val="0"/>
           <w:sz w:val="20"/>
+          <w:szCs w:val="22"/>
         </w:rPr>
-        <w:t>:</w:t>
-        <w:br/>
+        <w:t>2) AI 머신러닝의 신기한 점:</w:t>
+      </w:r>
+      <w:r>
+        <w:br w:type="textWrapping"/>
       </w:r>
       <w:r>
         <w:rPr>
+          <w:rFonts w:ascii="Cambria" w:hAnsi="Cambria" w:eastAsia="ＭＳ 明朝" w:cs="Cambria" w:asciiTheme="minorHAnsi" w:hAnsiTheme="minorHAnsi" w:eastAsiaTheme="minorEastAsia" w:csTheme="minorBidi"/>
+          <w:kern w:val="0"/>
           <w:sz w:val="20"/>
+          <w:szCs w:val="22"/>
         </w:rPr>
-        <w:t>식물을 분류하고 관찰할 때는 단순히 전체적인 겉모습만 보는 것보다</w:t>
+        <w:t>사람이 일일이 "이 꽃은 이렇게 생겼어" 하고 공식을 알려주지 않아도, 많은 꽃의 크기 데이터를 관찰하게 하니 AI가 스스로 '스무고개 지도'를 만들어 100% 정답을 맞힌다는 점이 매우 놀라웠다.</w:t>
+      </w:r>
+      <w:r>
+        <w:br w:type="textWrapping"/>
+      </w:r>
+      <w:r>
+        <w:br w:type="textWrapping"/>
       </w:r>
       <w:r>
         <w:rPr>
+          <w:rFonts w:ascii="Cambria" w:hAnsi="Cambria" w:eastAsia="ＭＳ 明朝" w:cs="Cambria" w:asciiTheme="minorHAnsi" w:hAnsiTheme="minorHAnsi" w:eastAsiaTheme="minorEastAsia" w:csTheme="minorBidi"/>
+          <w:kern w:val="0"/>
           <w:sz w:val="20"/>
+          <w:szCs w:val="22"/>
         </w:rPr>
-        <w:t xml:space="preserve">, </w:t>
+        <w:t>3) 앞으로의 다짐:</w:t>
+      </w:r>
+      <w:r>
+        <w:br w:type="textWrapping"/>
       </w:r>
       <w:r>
         <w:rPr>
+          <w:rFonts w:ascii="Cambria" w:hAnsi="Cambria" w:eastAsia="ＭＳ 明朝" w:cs="Cambria" w:asciiTheme="minorHAnsi" w:hAnsiTheme="minorHAnsi" w:eastAsiaTheme="minorEastAsia" w:csTheme="minorBidi"/>
+          <w:kern w:val="0"/>
           <w:sz w:val="20"/>
+          <w:szCs w:val="22"/>
         </w:rPr>
-        <w:t>꽃잎 크기처럼 품종마다 뚜렷한 차이를 보이는 핵심 신체 부위를 정확히 측정하는 것이 가장 중요하다는 사실을 깨달았다</w:t>
-      </w:r>
-      <w:r>
-        <w:rPr>
-          <w:sz w:val="20"/>
-        </w:rPr>
-        <w:t>.</w:t>
-        <w:br/>
-        <w:br/>
-        <w:t xml:space="preserve">2) AI </w:t>
-      </w:r>
-      <w:r>
-        <w:rPr>
-          <w:sz w:val="20"/>
-        </w:rPr>
-        <w:t>머신러닝의 신기한 점</w:t>
-      </w:r>
-      <w:r>
-        <w:rPr>
-          <w:sz w:val="20"/>
-        </w:rPr>
-        <w:t>:</w:t>
-        <w:br/>
-      </w:r>
-      <w:r>
-        <w:rPr>
-          <w:sz w:val="20"/>
-        </w:rPr>
-        <w:t xml:space="preserve">사람이 일일이 </w:t>
-      </w:r>
-      <w:r>
-        <w:rPr>
-          <w:sz w:val="20"/>
-        </w:rPr>
-        <w:t>"</w:t>
-      </w:r>
-      <w:r>
-        <w:rPr>
-          <w:sz w:val="20"/>
-        </w:rPr>
-        <w:t>이 꽃은 이렇게 생겼어</w:t>
-      </w:r>
-      <w:r>
-        <w:rPr>
-          <w:sz w:val="20"/>
-        </w:rPr>
-        <w:t xml:space="preserve">" </w:t>
-      </w:r>
-      <w:r>
-        <w:rPr>
-          <w:sz w:val="20"/>
-        </w:rPr>
-        <w:t>하고 공식을 알려주지 않아도</w:t>
-      </w:r>
-      <w:r>
-        <w:rPr>
-          <w:sz w:val="20"/>
-        </w:rPr>
-        <w:t xml:space="preserve">, </w:t>
-      </w:r>
-      <w:r>
-        <w:rPr>
-          <w:sz w:val="20"/>
-        </w:rPr>
-        <w:t xml:space="preserve">많은 꽃의 크기 데이터를 관찰하게 하니 </w:t>
-      </w:r>
-      <w:r>
-        <w:rPr>
-          <w:sz w:val="20"/>
-        </w:rPr>
-        <w:t>AI</w:t>
-      </w:r>
-      <w:r>
-        <w:rPr>
-          <w:sz w:val="20"/>
-        </w:rPr>
-        <w:t xml:space="preserve">가 스스로 </w:t>
-      </w:r>
-      <w:r>
-        <w:rPr>
-          <w:sz w:val="20"/>
-        </w:rPr>
-        <w:t>'</w:t>
-      </w:r>
-      <w:r>
-        <w:rPr>
-          <w:sz w:val="20"/>
-        </w:rPr>
-        <w:t>스무고개 지도</w:t>
-      </w:r>
-      <w:r>
-        <w:rPr>
-          <w:sz w:val="20"/>
-        </w:rPr>
-        <w:t>'</w:t>
-      </w:r>
-      <w:r>
-        <w:rPr>
-          <w:sz w:val="20"/>
-        </w:rPr>
-        <w:t xml:space="preserve">를 만들어 </w:t>
-      </w:r>
-      <w:r>
-        <w:rPr>
-          <w:sz w:val="20"/>
-        </w:rPr>
-        <w:t xml:space="preserve">100% </w:t>
-      </w:r>
-      <w:r>
-        <w:rPr>
-          <w:sz w:val="20"/>
-        </w:rPr>
-        <w:t>정답을 맞힌다는 점이 매우 놀라웠다</w:t>
-      </w:r>
-      <w:r>
-        <w:rPr>
-          <w:sz w:val="20"/>
-        </w:rPr>
-        <w:t>.</w:t>
-        <w:br/>
-        <w:br/>
-        <w:t xml:space="preserve">3) </w:t>
-      </w:r>
-      <w:r>
-        <w:rPr>
-          <w:sz w:val="20"/>
-        </w:rPr>
-        <w:t>앞으로의 다짐</w:t>
-      </w:r>
-      <w:r>
-        <w:rPr>
-          <w:sz w:val="20"/>
-        </w:rPr>
-        <w:t>:</w:t>
-        <w:br/>
-      </w:r>
-      <w:r>
-        <w:rPr>
-          <w:sz w:val="20"/>
-        </w:rPr>
-        <w:t>앞으로 학교 화단이나 식물원에서 다양한 꽃과 나뭇잎을 관찰할 때도 길이나 너비 같은 특징을 꼼꼼하게 기록해보고</w:t>
-      </w:r>
-      <w:r>
-        <w:rPr>
-          <w:sz w:val="20"/>
-        </w:rPr>
-        <w:t>, AI</w:t>
-      </w:r>
-      <w:r>
-        <w:rPr>
-          <w:sz w:val="20"/>
-        </w:rPr>
-        <w:t>를 활용해 다양한 생물을 분류하는 나만의 스마트 식물 도감을 만들어보고 싶다</w:t>
-      </w:r>
-      <w:r>
-        <w:rPr>
-          <w:sz w:val="20"/>
-        </w:rPr>
-        <w:t>.</w:t>
+        <w:t xml:space="preserve">앞으로 학교 화단이나 식물원에서 다양한 꽃과 나뭇잎을 관찰할 때도 길이나 너비 같은 특징을 꼼꼼하게 기록해보고, AI를 활용해 다양한 생물을 분류하는 나만의 스마트 식물 도감을 만들어보고 싶다. </w:t>
       </w:r>
     </w:p>
     <w:sectPr>
       <w:type w:val="nextPage"/>
       <w:pgSz w:w="12240" w:h="15840"/>
-      <w:pgMar w:left="1800" w:right="1800" w:gutter="0" w:header="0" w:top="1440" w:footer="0" w:bottom="1440"/>
-      <w:pgNumType w:fmt="decimal"/>
-      <w:formProt w:val="false"/>
-      <w:textDirection w:val="lrTb"/>
+      <w:pgMar w:top="1440" w:right="1800" w:bottom="1440" w:left="1800" w:header="0" w:footer="0" w:gutter="0"/>
       <w:docGrid w:type="default" w:linePitch="360" w:charSpace="4096"/>
     </w:sectPr>
   </w:body>

</xml_diff>